<commit_message>
Update citation.docx: refilled abstracts via CrossRef/S2/OpenReview
</commit_message>
<xml_diff>
--- a/citation.docx
+++ b/citation.docx
@@ -16,12 +16,12 @@
           <w:i/>
           <w:sz w:val="18"/>
         </w:rPr>
-        <w:t>Reference paper: TCTrack: Temporal Contexts for Aerial Tracking (Cao et al., CVPR 2022, arXiv:2203.01885). Compiled 2026-10-11. Source: OpenAlex citation graph (includes abstracts reconstructed from OpenAlex inverted indexes).</w:t>
-      </w:r>
-    </w:p>
-    <w:p>
-      <w:r>
-        <w:t>Citing works found: 269 | with abstracts: 192 | metadata only: 77.</w:t>
+        <w:t>Reference paper: TCTrack: Temporal Contexts for Aerial Tracking (Cao et al., CVPR 2022, arXiv:2203.01885). Compiled 2026-10-11. Sources: OpenAlex citation graph, CrossRef, Semantic Scholar, OpenReview.</w:t>
+      </w:r>
+    </w:p>
+    <w:p>
+      <w:r>
+        <w:t>Citing works found: 269 | with abstracts: 216 | metadata only: 53.</w:t>
       </w:r>
     </w:p>
     <w:p>
@@ -203,7 +203,7 @@
         <w:pStyle w:val="Heading2"/>
       </w:pPr>
       <w:r>
-        <w:t>7. Moving Target Tracking by Unmanned Aerial Vehicle: A Survey and Taxonomy (2024)</w:t>
+        <w:t>7. Siamese object tracking for unmanned aerial vehicle: a review and comprehensive analysis (2023)</w:t>
       </w:r>
     </w:p>
     <w:p>
@@ -212,6 +212,44 @@
           <w:i/>
           <w:sz w:val="18"/>
         </w:rPr>
+        <w:t>Changhong Fu, Kunhan Lu, Guangze Zheng, Junjie Ye, Ziang Cao, Bowen Li, Geng Lu; Artificial Intelligence Review</w:t>
+      </w:r>
+      <w:r>
+        <w:rPr>
+          <w:color w:val="1F4E79"/>
+          <w:sz w:val="18"/>
+        </w:rPr>
+        <w:t xml:space="preserve">  |  https://doi.org/10.1007/s10462-023-10558-5</w:t>
+      </w:r>
+    </w:p>
+    <w:p>
+      <w:r>
+        <w:rPr>
+          <w:color w:val="808080"/>
+          <w:sz w:val="16"/>
+        </w:rPr>
+        <w:t>[abstract source: semanticscholar]</w:t>
+      </w:r>
+    </w:p>
+    <w:p>
+      <w:r>
+        <w:t>Unmanned aerial vehicle (UAV)-based visual object tracking has enabled a wide range of applications and attracted increasing attention in the field of artificial intelligence (AI) because of its versatility and effectiveness. As an emerging force in the revolutionary trend of deep learning, Siamese networks shine in UAV-based object tracking with their promising balance of accuracy, robustness, and speed. Thanks to the development of embedded processors and the gradual optimization of deep neural networks, Siamese trackers receive extensive research and realize preliminary combinations with UAVs. However, due to the UAV’s limited onboard computational resources and the complex real-world circumstances, aerial tracking with Siamese networks still faces severe obstacles in many aspects. To further explore the deployment of Siamese networks in UAV-based tracking, this work presents a comprehensive review of leading-edge Siamese trackers, along with an exhaustive UAV-specific analysis based on the evaluation using a typical UAV onboard processor. Then, the onboard tests are conducted to validate the feasibility and efficacy of representative Siamese trackers in real-world UAV deployment. Furthermore, to better promote the development of the tracking community, this work analyzes the limitations of existing Siamese trackers and conducts additional experiments represented by low-illumination evaluations. In the end, prospects for the development of Siamese tracking for UAV-based AI systems are deeply discussed. The unified framework of leading-edge Siamese trackers, i.e. , code library, and the results of their experimental evaluations are available at https://github.com/vision4robotics/SiameseTracking4UAV .</w:t>
+      </w:r>
+    </w:p>
+    <w:p>
+      <w:pPr>
+        <w:pStyle w:val="Heading2"/>
+      </w:pPr>
+      <w:r>
+        <w:t>8. Moving Target Tracking by Unmanned Aerial Vehicle: A Survey and Taxonomy (2024)</w:t>
+      </w:r>
+    </w:p>
+    <w:p>
+      <w:r>
+        <w:rPr>
+          <w:i/>
+          <w:sz w:val="18"/>
+        </w:rPr>
         <w:t>Nianyi Sun, Jin Zhao, Qing Shi, Chang Liu, Peng Liu; IEEE Transactions on Industrial Informatics</w:t>
       </w:r>
       <w:r>
@@ -232,7 +270,7 @@
         <w:pStyle w:val="Heading2"/>
       </w:pPr>
       <w:r>
-        <w:t>8. Consistent Representation Mining for Multi-Drone Single Object Tracking (2024)</w:t>
+        <w:t>9. Consistent Representation Mining for Multi-Drone Single Object Tracking (2024)</w:t>
       </w:r>
     </w:p>
     <w:p>
@@ -261,7 +299,7 @@
         <w:pStyle w:val="Heading2"/>
       </w:pPr>
       <w:r>
-        <w:t>9. AVLTrack: Dynamic Sparse Learning for Aerial Vision-Language Tracking (2025)</w:t>
+        <w:t>10. AVLTrack: Dynamic Sparse Learning for Aerial Vision-Language Tracking (2025)</w:t>
       </w:r>
     </w:p>
     <w:p>
@@ -290,7 +328,7 @@
         <w:pStyle w:val="Heading2"/>
       </w:pPr>
       <w:r>
-        <w:t>10. Transformer Meets Remote Sensing Video Detection and Tracking: A Comprehensive Survey (2023)</w:t>
+        <w:t>11. Transformer Meets Remote Sensing Video Detection and Tracking: A Comprehensive Survey (2023)</w:t>
       </w:r>
     </w:p>
     <w:p>
@@ -319,7 +357,7 @@
         <w:pStyle w:val="Heading2"/>
       </w:pPr>
       <w:r>
-        <w:t>11. Adaptive and Background-Aware Vision Transformer for Real-Time UAV Tracking (2023)</w:t>
+        <w:t>12. Adaptive and Background-Aware Vision Transformer for Real-Time UAV Tracking (2023)</w:t>
       </w:r>
     </w:p>
     <w:p>
@@ -348,7 +386,7 @@
         <w:pStyle w:val="Heading2"/>
       </w:pPr>
       <w:r>
-        <w:t>12. Similarity-Guided Layer-Adaptive Vision Transformer for UAV Tracking (2025)</w:t>
+        <w:t>13. Similarity-Guided Layer-Adaptive Vision Transformer for UAV Tracking (2025)</w:t>
       </w:r>
     </w:p>
     <w:p>
@@ -377,7 +415,7 @@
         <w:pStyle w:val="Heading2"/>
       </w:pPr>
       <w:r>
-        <w:t>13. A Survey on Autonomous and Intelligent Swarms of Uncrewed Aerial Vehicles (UAVs) (2025)</w:t>
+        <w:t>14. A Survey on Autonomous and Intelligent Swarms of Uncrewed Aerial Vehicles (UAVs) (2025)</w:t>
       </w:r>
     </w:p>
     <w:p>
@@ -406,7 +444,7 @@
         <w:pStyle w:val="Heading2"/>
       </w:pPr>
       <w:r>
-        <w:t>14. CDC-YOLOFusion: Leveraging Cross-Scale Dynamic Convolution Fusion for Visible-Infrared Object Detection (2024)</w:t>
+        <w:t>15. CDC-YOLOFusion: Leveraging Cross-Scale Dynamic Convolution Fusion for Visible-Infrared Object Detection (2024)</w:t>
       </w:r>
     </w:p>
     <w:p>
@@ -435,7 +473,7 @@
         <w:pStyle w:val="Heading2"/>
       </w:pPr>
       <w:r>
-        <w:t>15. Learning Target-Aware Vision Transformers for Real-Time UAV Tracking (2024)</w:t>
+        <w:t>16. Learning Target-Aware Vision Transformers for Real-Time UAV Tracking (2024)</w:t>
       </w:r>
     </w:p>
     <w:p>
@@ -464,7 +502,7 @@
         <w:pStyle w:val="Heading2"/>
       </w:pPr>
       <w:r>
-        <w:t>16. SiamMDM: An Adaptive Fusion Network With Dynamic Template for Real-Time Satellite Video Single Object Tracking (2023)</w:t>
+        <w:t>17. SiamMDM: An Adaptive Fusion Network With Dynamic Template for Real-Time Satellite Video Single Object Tracking (2023)</w:t>
       </w:r>
     </w:p>
     <w:p>
@@ -493,7 +531,7 @@
         <w:pStyle w:val="Heading2"/>
       </w:pPr>
       <w:r>
-        <w:t>17. A3Track: Achieving Precise Target Tracking in Aerial Images With Receptive Field Alignment (2023)</w:t>
+        <w:t>18. A3Track: Achieving Precise Target Tracking in Aerial Images With Receptive Field Alignment (2023)</w:t>
       </w:r>
     </w:p>
     <w:p>
@@ -522,7 +560,7 @@
         <w:pStyle w:val="Heading2"/>
       </w:pPr>
       <w:r>
-        <w:t>18. CMAT: Integrating Convolution Mixer and Self-Attention for Visual Tracking (2023)</w:t>
+        <w:t>19. CMAT: Integrating Convolution Mixer and Self-Attention for Visual Tracking (2023)</w:t>
       </w:r>
     </w:p>
     <w:p>
@@ -551,7 +589,7 @@
         <w:pStyle w:val="Heading2"/>
       </w:pPr>
       <w:r>
-        <w:t>19. Object Tracking Based on a Time-Varying Spatio-Temporal Regularized Correlation Filter With Aberrance Repression (2022)</w:t>
+        <w:t>20. Object Tracking Based on a Time-Varying Spatio-Temporal Regularized Correlation Filter With Aberrance Repression (2022)</w:t>
       </w:r>
     </w:p>
     <w:p>
@@ -580,7 +618,7 @@
         <w:pStyle w:val="Heading2"/>
       </w:pPr>
       <w:r>
-        <w:t>20. Learning an Adaptive and View-Invariant Vision Transformer for Real-Time UAV Tracking (2025)</w:t>
+        <w:t>21. Learning an Adaptive and View-Invariant Vision Transformer for Real-Time UAV Tracking (2025)</w:t>
       </w:r>
     </w:p>
     <w:p>
@@ -609,7 +647,7 @@
         <w:pStyle w:val="Heading2"/>
       </w:pPr>
       <w:r>
-        <w:t>21. Cervical Cell Segmentation Method Based on Global Dependency and Local Attention (2022)</w:t>
+        <w:t>22. Cervical Cell Segmentation Method Based on Global Dependency and Local Attention (2022)</w:t>
       </w:r>
     </w:p>
     <w:p>
@@ -638,7 +676,7 @@
         <w:pStyle w:val="Heading2"/>
       </w:pPr>
       <w:r>
-        <w:t>22. HighlightNet: Highlighting Low-Light Potential Features for Real-Time UAV Tracking (2022)</w:t>
+        <w:t>23. HighlightNet: Highlighting Low-Light Potential Features for Real-Time UAV Tracking (2022)</w:t>
       </w:r>
     </w:p>
     <w:p>
@@ -667,7 +705,7 @@
         <w:pStyle w:val="Heading2"/>
       </w:pPr>
       <w:r>
-        <w:t>23. Hyperspectral Video Tracking With Spectral–Spatial Fusion and Memory Enhancement (2025)</w:t>
+        <w:t>24. Hyperspectral Video Tracking With Spectral–Spatial Fusion and Memory Enhancement (2025)</w:t>
       </w:r>
     </w:p>
     <w:p>
@@ -696,7 +734,7 @@
         <w:pStyle w:val="Heading2"/>
       </w:pPr>
       <w:r>
-        <w:t>24. DroneMOT: Drone-based Multi-Object Tracking Considering Detection Difficulties and Simultaneous Moving of Drones and Objects (2024)</w:t>
+        <w:t>25. DroneMOT: Drone-based Multi-Object Tracking Considering Detection Difficulties and Simultaneous Moving of Drones and Objects (2024)</w:t>
       </w:r>
     </w:p>
     <w:p>
@@ -725,7 +763,7 @@
         <w:pStyle w:val="Heading2"/>
       </w:pPr>
       <w:r>
-        <w:t>25. Multi-Step Temporal Modeling for UAV Tracking (2024)</w:t>
+        <w:t>26. Multi-Step Temporal Modeling for UAV Tracking (2024)</w:t>
       </w:r>
     </w:p>
     <w:p>
@@ -754,7 +792,7 @@
         <w:pStyle w:val="Heading2"/>
       </w:pPr>
       <w:r>
-        <w:t>26. Resource-Efficient RGBD Aerial Tracking (2023)</w:t>
+        <w:t>27. Resource-Efficient RGBD Aerial Tracking (2023)</w:t>
       </w:r>
     </w:p>
     <w:p>
@@ -783,7 +821,7 @@
         <w:pStyle w:val="Heading2"/>
       </w:pPr>
       <w:r>
-        <w:t>27. A Spectral–Spatial Transformer Fusion Method for Hyperspectral Video Tracking (2023)</w:t>
+        <w:t>28. A Spectral–Spatial Transformer Fusion Method for Hyperspectral Video Tracking (2023)</w:t>
       </w:r>
     </w:p>
     <w:p>
@@ -812,7 +850,7 @@
         <w:pStyle w:val="Heading2"/>
       </w:pPr>
       <w:r>
-        <w:t>28. BACTrack: Building Appearance Collection for Aerial Tracking (2023)</w:t>
+        <w:t>29. BACTrack: Building Appearance Collection for Aerial Tracking (2023)</w:t>
       </w:r>
     </w:p>
     <w:p>
@@ -841,7 +879,7 @@
         <w:pStyle w:val="Heading2"/>
       </w:pPr>
       <w:r>
-        <w:t>29. SiamTHN: Siamese Target Highlight Network for Visual Tracking (2023)</w:t>
+        <w:t>30. SiamTHN: Siamese Target Highlight Network for Visual Tracking (2023)</w:t>
       </w:r>
     </w:p>
     <w:p>
@@ -870,7 +908,7 @@
         <w:pStyle w:val="Heading2"/>
       </w:pPr>
       <w:r>
-        <w:t>30. Target-Aware Tracking With Spatial-Temporal Context Attention (2024)</w:t>
+        <w:t>31. Target-Aware Tracking With Spatial-Temporal Context Attention (2024)</w:t>
       </w:r>
     </w:p>
     <w:p>
@@ -899,7 +937,7 @@
         <w:pStyle w:val="Heading2"/>
       </w:pPr>
       <w:r>
-        <w:t>31. PVT++: A Simple End-to-End Latency-Aware Visual Tracking Framework (2023)</w:t>
+        <w:t>32. PVT++: A Simple End-to-End Latency-Aware Visual Tracking Framework (2023)</w:t>
       </w:r>
     </w:p>
     <w:p>
@@ -928,7 +966,7 @@
         <w:pStyle w:val="Heading2"/>
       </w:pPr>
       <w:r>
-        <w:t>32. Hyperspectral Video Target Tracking Based on Deep Features with Spectral Matching Reduction and Adaptive Scale 3D Hog Features (2022)</w:t>
+        <w:t>33. Hyperspectral Video Target Tracking Based on Deep Features with Spectral Matching Reduction and Adaptive Scale 3D Hog Features (2022)</w:t>
       </w:r>
     </w:p>
     <w:p>
@@ -957,7 +995,7 @@
         <w:pStyle w:val="Heading2"/>
       </w:pPr>
       <w:r>
-        <w:t>33. SAM-DA: UAV Tracks Anything at Night with SAM-Powered Domain Adaptation (2024)</w:t>
+        <w:t>34. SAM-DA: UAV Tracks Anything at Night with SAM-Powered Domain Adaptation (2024)</w:t>
       </w:r>
     </w:p>
     <w:p>
@@ -986,7 +1024,7 @@
         <w:pStyle w:val="Heading2"/>
       </w:pPr>
       <w:r>
-        <w:t>34. UAV target tracking: a survey (2025)</w:t>
+        <w:t>35. UAV target tracking: a survey (2025)</w:t>
       </w:r>
     </w:p>
     <w:p>
@@ -1015,7 +1053,7 @@
         <w:pStyle w:val="Heading2"/>
       </w:pPr>
       <w:r>
-        <w:t>35. Fine-Grained Feature and Template Reconstruction for TIR Object Tracking (2025)</w:t>
+        <w:t>36. Fine-Grained Feature and Template Reconstruction for TIR Object Tracking (2025)</w:t>
       </w:r>
     </w:p>
     <w:p>
@@ -1044,7 +1082,7 @@
         <w:pStyle w:val="Heading2"/>
       </w:pPr>
       <w:r>
-        <w:t>36. UAV-Ground Visual Tracking: A Unified Dataset and Collaborative Learning Approach (2023)</w:t>
+        <w:t>37. UAV-Ground Visual Tracking: A Unified Dataset and Collaborative Learning Approach (2023)</w:t>
       </w:r>
     </w:p>
     <w:p>
@@ -1073,7 +1111,7 @@
         <w:pStyle w:val="Heading2"/>
       </w:pPr>
       <w:r>
-        <w:t>37. A Transformer-based visual object tracker via learning immediate appearance change (2024)</w:t>
+        <w:t>38. A Transformer-based visual object tracker via learning immediate appearance change (2024)</w:t>
       </w:r>
     </w:p>
     <w:p>
@@ -1102,7 +1140,7 @@
         <w:pStyle w:val="Heading2"/>
       </w:pPr>
       <w:r>
-        <w:t>38. Siamese Object Tracking for Vision-Based UAM Approaching with Pairwise Scale-Channel Attention (2022)</w:t>
+        <w:t>39. Siamese Object Tracking for Vision-Based UAM Approaching with Pairwise Scale-Channel Attention (2022)</w:t>
       </w:r>
     </w:p>
     <w:p>
@@ -1131,7 +1169,7 @@
         <w:pStyle w:val="Heading2"/>
       </w:pPr>
       <w:r>
-        <w:t>39. Towards Universal Modal Tracking With Online Dense Temporal Token Learning (2025)</w:t>
+        <w:t>40. Towards Universal Modal Tracking With Online Dense Temporal Token Learning (2025)</w:t>
       </w:r>
     </w:p>
     <w:p>
@@ -1160,7 +1198,7 @@
         <w:pStyle w:val="Heading2"/>
       </w:pPr>
       <w:r>
-        <w:t>40. Local Perception-Aware Transformer for Aerial Tracking (2022)</w:t>
+        <w:t>41. Local Perception-Aware Transformer for Aerial Tracking (2022)</w:t>
       </w:r>
     </w:p>
     <w:p>
@@ -1189,7 +1227,7 @@
         <w:pStyle w:val="Heading2"/>
       </w:pPr>
       <w:r>
-        <w:t>41. Slight Aware Enhancement Transformer and Multiple Matching Network for Real-Time UAV Tracking (2023)</w:t>
+        <w:t>42. Slight Aware Enhancement Transformer and Multiple Matching Network for Real-Time UAV Tracking (2023)</w:t>
       </w:r>
     </w:p>
     <w:p>
@@ -1218,7 +1256,7 @@
         <w:pStyle w:val="Heading2"/>
       </w:pPr>
       <w:r>
-        <w:t>42. Visible–Infrared Dual-Sensor Fusion for Single-Object Tracking (2023)</w:t>
+        <w:t>43. Visible–Infrared Dual-Sensor Fusion for Single-Object Tracking (2023)</w:t>
       </w:r>
     </w:p>
     <w:p>
@@ -1247,7 +1285,7 @@
         <w:pStyle w:val="Heading2"/>
       </w:pPr>
       <w:r>
-        <w:t>43. Facing Completely Occluded Short-Term Tracking Based on Correlation Filters (2023)</w:t>
+        <w:t>44. BioDrone: A Bionic Drone-Based Single Object Tracking Benchmark for Robust Vision (2023)</w:t>
       </w:r>
     </w:p>
     <w:p>
@@ -1256,6 +1294,82 @@
           <w:i/>
           <w:sz w:val="18"/>
         </w:rPr>
+        <w:t>Xin Bo Zhao, Shiyu Hu, Yipei Wang, Jing Zhang, Yimin Hu, Rongshuai Liu, Haibin Ling, Yin Li; International Journal of Computer Vision</w:t>
+      </w:r>
+      <w:r>
+        <w:rPr>
+          <w:color w:val="1F4E79"/>
+          <w:sz w:val="18"/>
+        </w:rPr>
+        <w:t xml:space="preserve">  |  https://doi.org/10.1007/s11263-023-01937-0</w:t>
+      </w:r>
+    </w:p>
+    <w:p>
+      <w:r>
+        <w:rPr>
+          <w:color w:val="808080"/>
+          <w:sz w:val="16"/>
+        </w:rPr>
+        <w:t>[abstract source: semanticscholar]</w:t>
+      </w:r>
+    </w:p>
+    <w:p>
+      <w:r>
+        <w:t>Single object tracking (SOT) is a fundamental problem in computer vision, with a wide range of applications, including autonomous driving, augmented reality, and robot navigation. The robustness of SOT faces two main challenges: tiny target and fast motion. These challenges are especially manifested in videos captured by unmanned aerial vehicles (UAV), where the target is usually far away from the camera and often with significant motion relative to the camera. To evaluate the robustness of SOT methods, we propose BioDrone—the first bionic drone-based visual benchmark for SOT. Unlike existing UAV datasets, BioDrone features videos captured from a flapping-wing UAV system with a major camera shake due to its aerodynamics. BioDrone hence highlights the tracking of tiny targets with drastic changes between consecutive frames, providing a new robust vision benchmark for SOT. To date, BioDrone offers the largest UAV-based SOT benchmark with high-quality fine-grained manual annotations and automatically generates frame-level labels, designed for robust vision analyses. Leveraging our proposed BioDrone, we conduct a systematic evaluation of existing SOT methods, comparing the performance of 20 representative models and studying novel means of optimizing a SOTA method (KeepTrack Mayer et al. in: Proceedings of the IEEE/CVF international conference on computer vision, pp. 13444–13454, 2021) for robust SOT. Our evaluation leads to new baselines and insights for robust SOT. Moving forward, we hope that BioDrone will not only serve as a high-quality benchmark for robust SOT, but also invite future research into robust computer vision. The database, toolkits, evaluation server, and baseline results are available at http://biodrone.aitestunion.com.</w:t>
+      </w:r>
+    </w:p>
+    <w:p>
+      <w:pPr>
+        <w:pStyle w:val="Heading2"/>
+      </w:pPr>
+      <w:r>
+        <w:t>45. Exploring reliable infrared object tracking with spatio-temporal fusion transformer (2023)</w:t>
+      </w:r>
+    </w:p>
+    <w:p>
+      <w:r>
+        <w:rPr>
+          <w:i/>
+          <w:sz w:val="18"/>
+        </w:rPr>
+        <w:t>Meibin Qi, Qinxin Wang, Shuo Zhuang, Ke Zhang, Kunyuan Li, Yimin Liu, Yanfang Yang; Knowledge-Based Systems</w:t>
+      </w:r>
+      <w:r>
+        <w:rPr>
+          <w:color w:val="1F4E79"/>
+          <w:sz w:val="18"/>
+        </w:rPr>
+        <w:t xml:space="preserve">  |  https://doi.org/10.1016/j.knosys.2023.111234</w:t>
+      </w:r>
+    </w:p>
+    <w:p>
+      <w:r>
+        <w:rPr>
+          <w:color w:val="808080"/>
+          <w:sz w:val="16"/>
+        </w:rPr>
+        <w:t>[abstract source: openreview]</w:t>
+      </w:r>
+    </w:p>
+    <w:p>
+      <w:r>
+        <w:t>Highlights•This paper proposes a spatio-temporal fusion Transformer model for infrared target tracking.•The dynamic template state estimation module integrates the fine-grained feature information of salient points.•The designed IOU-Aware TSE head leverages an IoU-based metric to evaluate the current state of the target image.</w:t>
+      </w:r>
+    </w:p>
+    <w:p>
+      <w:pPr>
+        <w:pStyle w:val="Heading2"/>
+      </w:pPr>
+      <w:r>
+        <w:t>46. Facing Completely Occluded Short-Term Tracking Based on Correlation Filters (2023)</w:t>
+      </w:r>
+    </w:p>
+    <w:p>
+      <w:r>
+        <w:rPr>
+          <w:i/>
+          <w:sz w:val="18"/>
+        </w:rPr>
         <w:t>Yuanming Zhang, Huihui Pan, Jue Wang, Weichao Sun; IEEE Transactions on Instrumentation and Measurement</w:t>
       </w:r>
       <w:r>
@@ -1276,7 +1390,7 @@
         <w:pStyle w:val="Heading2"/>
       </w:pPr>
       <w:r>
-        <w:t>44. SiamBRF: Siamese Broad-Spectrum Relevance Fusion Network for Aerial Tracking (2024)</w:t>
+        <w:t>47. SiamBRF: Siamese Broad-Spectrum Relevance Fusion Network for Aerial Tracking (2024)</w:t>
       </w:r>
     </w:p>
     <w:p>
@@ -1305,7 +1419,7 @@
         <w:pStyle w:val="Heading2"/>
       </w:pPr>
       <w:r>
-        <w:t>45. Saliency Guided Siamese Attention Network for Infrared Ship Target Tracking (2024)</w:t>
+        <w:t>48. Saliency Guided Siamese Attention Network for Infrared Ship Target Tracking (2024)</w:t>
       </w:r>
     </w:p>
     <w:p>
@@ -1334,7 +1448,7 @@
         <w:pStyle w:val="Heading2"/>
       </w:pPr>
       <w:r>
-        <w:t>46. Sequential Fusion Based Multi-Granularity Consistency for Space-Time Transformer Tracking (2024)</w:t>
+        <w:t>49. Sequential Fusion Based Multi-Granularity Consistency for Space-Time Transformer Tracking (2024)</w:t>
       </w:r>
     </w:p>
     <w:p>
@@ -1363,7 +1477,7 @@
         <w:pStyle w:val="Heading2"/>
       </w:pPr>
       <w:r>
-        <w:t>47. Adaptive Trajectory Correction for Underwater Object Tracking (2025)</w:t>
+        <w:t>50. Adaptive Trajectory Correction for Underwater Object Tracking (2025)</w:t>
       </w:r>
     </w:p>
     <w:p>
@@ -1392,7 +1506,7 @@
         <w:pStyle w:val="Heading2"/>
       </w:pPr>
       <w:r>
-        <w:t>48. Correlation Filters for UAV Online Tracking Based on Complementary Appearance Model and Reversibility Reasoning (2023)</w:t>
+        <w:t>51. Correlation Filters for UAV Online Tracking Based on Complementary Appearance Model and Reversibility Reasoning (2023)</w:t>
       </w:r>
     </w:p>
     <w:p>
@@ -1421,7 +1535,7 @@
         <w:pStyle w:val="Heading2"/>
       </w:pPr>
       <w:r>
-        <w:t>49. SiamMAN: Siamese Multi-Phase Aware Network for Real-Time Unmanned Aerial Vehicle Tracking (2023)</w:t>
+        <w:t>52. SiamMAN: Siamese Multi-Phase Aware Network for Real-Time Unmanned Aerial Vehicle Tracking (2023)</w:t>
       </w:r>
     </w:p>
     <w:p>
@@ -1450,7 +1564,7 @@
         <w:pStyle w:val="Heading2"/>
       </w:pPr>
       <w:r>
-        <w:t>50. ViT Spatio-Temporal Feature Fusion for Aerial Object Tracking (2023)</w:t>
+        <w:t>53. ViT Spatio-Temporal Feature Fusion for Aerial Object Tracking (2023)</w:t>
       </w:r>
     </w:p>
     <w:p>
@@ -1479,7 +1593,7 @@
         <w:pStyle w:val="Heading2"/>
       </w:pPr>
       <w:r>
-        <w:t>51. Artificial Intelligence for Remote Sensing: Progress, Challenges, and Perspectives (2026)</w:t>
+        <w:t>54. Artificial Intelligence for Remote Sensing: Progress, Challenges, and Perspectives (2026)</w:t>
       </w:r>
     </w:p>
     <w:p>
@@ -1508,7 +1622,7 @@
         <w:pStyle w:val="Heading2"/>
       </w:pPr>
       <w:r>
-        <w:t>52. Online Multi-Scale Classification and Global Feature Modulation for Robust Visual Tracking (2023)</w:t>
+        <w:t>55. Online Multi-Scale Classification and Global Feature Modulation for Robust Visual Tracking (2023)</w:t>
       </w:r>
     </w:p>
     <w:p>
@@ -1537,7 +1651,7 @@
         <w:pStyle w:val="Heading2"/>
       </w:pPr>
       <w:r>
-        <w:t>53. Intrinsic Satellite Video Decomposition With Motion Target Energy Constraint (2022)</w:t>
+        <w:t>56. Temporal adaptive bidirectional bridging for RGB-D tracking (2024)</w:t>
       </w:r>
     </w:p>
     <w:p>
@@ -1546,6 +1660,44 @@
           <w:i/>
           <w:sz w:val="18"/>
         </w:rPr>
+        <w:t>Ge Ying, Dawei Zhang, Zhou Ou, Xiao Wang, Zheng Zheng; Pattern Recognition</w:t>
+      </w:r>
+      <w:r>
+        <w:rPr>
+          <w:color w:val="1F4E79"/>
+          <w:sz w:val="18"/>
+        </w:rPr>
+        <w:t xml:space="preserve">  |  https://doi.org/10.1016/j.patcog.2024.111053</w:t>
+      </w:r>
+    </w:p>
+    <w:p>
+      <w:r>
+        <w:rPr>
+          <w:color w:val="808080"/>
+          <w:sz w:val="16"/>
+        </w:rPr>
+        <w:t>[abstract source: openreview]</w:t>
+      </w:r>
+    </w:p>
+    <w:p>
+      <w:r>
+        <w:t>Highlights•We propose the first RGB-D three-stream tracking framework based on ViT.•We solve the issue of not utilizing temporal information in RGB-D object tracking.•The bidirectional bridging module can effectively fuse Depth and RGB features.•Experiments show our tracker achieves state-of-the-art performance on multiple benchmarks.</w:t>
+      </w:r>
+    </w:p>
+    <w:p>
+      <w:pPr>
+        <w:pStyle w:val="Heading2"/>
+      </w:pPr>
+      <w:r>
+        <w:t>57. Intrinsic Satellite Video Decomposition With Motion Target Energy Constraint (2022)</w:t>
+      </w:r>
+    </w:p>
+    <w:p>
+      <w:r>
+        <w:rPr>
+          <w:i/>
+          <w:sz w:val="18"/>
+        </w:rPr>
         <w:t>Jialei Pan, Yanfeng Gu, Shengyang Li, Guoming Gao, Shaochuan Wu; IEEE Transactions on Geoscience and Remote Sensing</w:t>
       </w:r>
       <w:r>
@@ -1566,7 +1718,7 @@
         <w:pStyle w:val="Heading2"/>
       </w:pPr>
       <w:r>
-        <w:t>54. Learning Dynamic-Sensitivity Enhanced Correlation Filter With Adaptive Second-Order Difference Spatial Regularization for UAV Tracking (2025)</w:t>
+        <w:t>58. Learning Dynamic-Sensitivity Enhanced Correlation Filter With Adaptive Second-Order Difference Spatial Regularization for UAV Tracking (2025)</w:t>
       </w:r>
     </w:p>
     <w:p>
@@ -1595,7 +1747,7 @@
         <w:pStyle w:val="Heading2"/>
       </w:pPr>
       <w:r>
-        <w:t>55. Spatial-Temporal Contextual Aggregation Siamese Network for UAV Tracking (2024)</w:t>
+        <w:t>59. Spatial-Temporal Contextual Aggregation Siamese Network for UAV Tracking (2024)</w:t>
       </w:r>
     </w:p>
     <w:p>
@@ -1624,7 +1776,7 @@
         <w:pStyle w:val="Heading2"/>
       </w:pPr>
       <w:r>
-        <w:t>56. Dynamic Template Updating Using Spatial-Temporal Information in Siamese Trackers (2023)</w:t>
+        <w:t>60. Towards universal and sparse adversarial examples for visual object tracking (2024)</w:t>
       </w:r>
     </w:p>
     <w:p>
@@ -1633,6 +1785,82 @@
           <w:i/>
           <w:sz w:val="18"/>
         </w:rPr>
+        <w:t>Jingjing Sheng, Dawei Zhang, Jianxin Chen, Xin Xiao, Zheng Zheng; Applied Soft Computing</w:t>
+      </w:r>
+      <w:r>
+        <w:rPr>
+          <w:color w:val="1F4E79"/>
+          <w:sz w:val="18"/>
+        </w:rPr>
+        <w:t xml:space="preserve">  |  https://doi.org/10.1016/j.asoc.2024.111252</w:t>
+      </w:r>
+    </w:p>
+    <w:p>
+      <w:r>
+        <w:rPr>
+          <w:color w:val="808080"/>
+          <w:sz w:val="16"/>
+        </w:rPr>
+        <w:t>[abstract source: openreview]</w:t>
+      </w:r>
+    </w:p>
+    <w:p>
+      <w:r>
+        <w:t>Highlights•We propose a universal and black-box adversarial example generation framework for video object tracking task.•Our USAE only requires changing a small part of the entire datasets, which is sparse and effective to attack the trackers.•We expand the USAE to Siamese trackers and beyond various types of trackers, demonstrating its generality and transferability.</w:t>
+      </w:r>
+    </w:p>
+    <w:p>
+      <w:pPr>
+        <w:pStyle w:val="Heading2"/>
+      </w:pPr>
+      <w:r>
+        <w:t>61. APPTracker+: Displacement Uncertainty for Occlusion Handling in Low-Frame-Rate Multiple Object Tracking (2024)</w:t>
+      </w:r>
+    </w:p>
+    <w:p>
+      <w:r>
+        <w:rPr>
+          <w:i/>
+          <w:sz w:val="18"/>
+        </w:rPr>
+        <w:t>Tao Zhou, Qi Ye, Wenhan Luo, Haizhou Ran, Zhiguo Shi, Jiming Chen; International Journal of Computer Vision</w:t>
+      </w:r>
+      <w:r>
+        <w:rPr>
+          <w:color w:val="1F4E79"/>
+          <w:sz w:val="18"/>
+        </w:rPr>
+        <w:t xml:space="preserve">  |  https://doi.org/10.1007/s11263-024-02237-x</w:t>
+      </w:r>
+    </w:p>
+    <w:p>
+      <w:r>
+        <w:rPr>
+          <w:color w:val="808080"/>
+          <w:sz w:val="16"/>
+        </w:rPr>
+        <w:t>[abstract source: openreview]</w:t>
+      </w:r>
+    </w:p>
+    <w:p>
+      <w:r>
+        <w:t>Multi-object tracking (MOT) in the scenario of low-frame-rate videos is a promising solution to better meet the computing, storage, and transmitting bandwidth resource constraints of edge devices. Tracking with a low frame rate poses particular challenges in the association stage as objects in two successive frames typically exhibit much quicker variations in locations, velocities, appearances, and visibilities than those in normal frame rates. In this paper, we observe severe performance degeneration of many existing association strategies caused by such variations. Though optical-flow-based methods like CenterTrack can handle the large displacement to some extent due to their large receptive field, the temporally local nature makes them fail to give reliable displacement estimations of objects that newly appear in the current frame (i.e., not visible in the previous frame). To overcome the local nature of optical-flow-based methods, we propose an online tracking method by extending the CenterTrack architecture with a new head, named APP, to recognize unreliable displacement estimations. Further, to capture the fine-grained and private unreliability of each displacement estimation, we extend the binary APP predictions to displacement uncertainties. To this end, we reformulate the displacement estimation task via Bayesian deep learning tools. With APP predictions, we propose to conduct association in a multi-stage manner where vision cues or historical motion cues are leveraged in the corresponding stage. By rethinking the commonly used bipartite matching algorithms, we equip the proposed multi-stage association policy with a hybrid matching strategy conditioned on displacement uncertainties. Our method shows robustness in preserving identities in low-frame-rate video sequences. Experimental results on public datasets in various low-frame-rate settings demonstrate the advantages of the proposed method.</w:t>
+      </w:r>
+    </w:p>
+    <w:p>
+      <w:pPr>
+        <w:pStyle w:val="Heading2"/>
+      </w:pPr>
+      <w:r>
+        <w:t>62. Dynamic Template Updating Using Spatial-Temporal Information in Siamese Trackers (2023)</w:t>
+      </w:r>
+    </w:p>
+    <w:p>
+      <w:r>
+        <w:rPr>
+          <w:i/>
+          <w:sz w:val="18"/>
+        </w:rPr>
         <w:t>Yuanhui Wang, Ben Ye, Zhanchuan Cai; IEEE Transactions on Multimedia</w:t>
       </w:r>
       <w:r>
@@ -1653,7 +1881,7 @@
         <w:pStyle w:val="Heading2"/>
       </w:pPr>
       <w:r>
-        <w:t>57. Online Background Discriminative Learning for Satellite Video Object Tracking (2024)</w:t>
+        <w:t>63. Learning Feature Restoration Transformer for Robust Dehazing Visual Object Tracking (2024)</w:t>
       </w:r>
     </w:p>
     <w:p>
@@ -1662,6 +1890,44 @@
           <w:i/>
           <w:sz w:val="18"/>
         </w:rPr>
+        <w:t>Tianyang Xu, Yifan Pan, Zhenhua Feng, Xuefeng Zhu, Chunyang Cheng, Xiao‐Jun Wu, Josef Kittler; International Journal of Computer Vision</w:t>
+      </w:r>
+      <w:r>
+        <w:rPr>
+          <w:color w:val="1F4E79"/>
+          <w:sz w:val="18"/>
+        </w:rPr>
+        <w:t xml:space="preserve">  |  https://doi.org/10.1007/s11263-024-02182-9</w:t>
+      </w:r>
+    </w:p>
+    <w:p>
+      <w:r>
+        <w:rPr>
+          <w:color w:val="808080"/>
+          <w:sz w:val="16"/>
+        </w:rPr>
+        <w:t>[abstract source: openreview]</w:t>
+      </w:r>
+    </w:p>
+    <w:p>
+      <w:r>
+        <w:t>In recent years, deep-learning-based visual object tracking has obtained promising results. However, a drastic performance drop is observed when transferring a pre-trained model to changing weather conditions, such as hazy imaging scenarios, where the data distribution differs from that of a natural training set. This problem challenges the open-world practical applications of accurate target tracking. In principle, visual tracking performance relies on the discriminative degree of features between the target and its surroundings, rather than the image-level visual quality. To this end, we design a feature restoration transformer that adaptively enhances the representation capability of the extracted visual features for robust tracking in both natural and hazy scenarios. Specifically, a feature restoration transformer is constructed with dedicated self-attention hierarchies for the refinement of potentially contaminated deep feature maps. We endow the feature extraction process with a refinement mechanism typically for hazy imaging scenarios, establishing a tracking system that is robust against foggy videos. In essence, the feature restoration transformer is jointly trained with a Siamese tracking transformer. Intuitively, the supervision for learning discriminative and salient features is facilitated by the entire restoration tracking system. The experimental results obtained on hazy imaging scenarios demonstrate the merits and superiority of the proposed restoration tracking system, with complementary restoration power to image-level dehazing. In addition, consistent advantages of our design can be observed when generalised to different video attributes, demonstrating its capacity to deal with open-world scenarios.</w:t>
+      </w:r>
+    </w:p>
+    <w:p>
+      <w:pPr>
+        <w:pStyle w:val="Heading2"/>
+      </w:pPr>
+      <w:r>
+        <w:t>64. Online Background Discriminative Learning for Satellite Video Object Tracking (2024)</w:t>
+      </w:r>
+    </w:p>
+    <w:p>
+      <w:r>
+        <w:rPr>
+          <w:i/>
+          <w:sz w:val="18"/>
+        </w:rPr>
         <w:t>Yanfei Zhong, Xueting Fang, Meng Shu; IEEE Transactions on Geoscience and Remote Sensing</w:t>
       </w:r>
       <w:r>
@@ -1682,7 +1948,7 @@
         <w:pStyle w:val="Heading2"/>
       </w:pPr>
       <w:r>
-        <w:t>58. Temporal contexts for motion tracking in ultrasound sequences with information bottleneck (2023)</w:t>
+        <w:t>65. Spatio-temporal mix deformable feature extractor in visual tracking (2023)</w:t>
       </w:r>
     </w:p>
     <w:p>
@@ -1691,6 +1957,44 @@
           <w:i/>
           <w:sz w:val="18"/>
         </w:rPr>
+        <w:t>Yucheng Huang, Ziwang Xiao, Eksan Firkat, Jinlai Zhang, Danfeng Wu, Askar Hamdulla; Expert Systems with Applications</w:t>
+      </w:r>
+      <w:r>
+        <w:rPr>
+          <w:color w:val="1F4E79"/>
+          <w:sz w:val="18"/>
+        </w:rPr>
+        <w:t xml:space="preserve">  |  https://doi.org/10.1016/j.eswa.2023.121377</w:t>
+      </w:r>
+    </w:p>
+    <w:p>
+      <w:r>
+        <w:rPr>
+          <w:color w:val="808080"/>
+          <w:sz w:val="16"/>
+        </w:rPr>
+        <w:t>[abstract source: openreview]</w:t>
+      </w:r>
+    </w:p>
+    <w:p>
+      <w:r>
+        <w:t>Highlights•Multi-frame fusion module improved upon ACMix.•Spatio-temporal context driven deformation for improving multi-frame trackers.•Spatio-temporal transformation for improving synthesized data.•Sufficient experiments have demonstrated its effectiveness.</w:t>
+      </w:r>
+    </w:p>
+    <w:p>
+      <w:pPr>
+        <w:pStyle w:val="Heading2"/>
+      </w:pPr>
+      <w:r>
+        <w:t>66. Temporal contexts for motion tracking in ultrasound sequences with information bottleneck (2023)</w:t>
+      </w:r>
+    </w:p>
+    <w:p>
+      <w:r>
+        <w:rPr>
+          <w:i/>
+          <w:sz w:val="18"/>
+        </w:rPr>
         <w:t>Mengxue Sun, Wenhui Huang, Huili Zhang, Yunfeng Shi, Jiale Wang, Qingtao Gong, Xiaoyan Wang; Medical Physics</w:t>
       </w:r>
       <w:r>
@@ -1711,7 +2015,7 @@
         <w:pStyle w:val="Heading2"/>
       </w:pPr>
       <w:r>
-        <w:t>59. Towards Discriminative Representations with Contrastive Instances for Real-Time UAV Tracking (2023)</w:t>
+        <w:t>67. Towards Discriminative Representations with Contrastive Instances for Real-Time UAV Tracking (2023)</w:t>
       </w:r>
     </w:p>
     <w:p>
@@ -1740,7 +2044,7 @@
         <w:pStyle w:val="Heading2"/>
       </w:pPr>
       <w:r>
-        <w:t>60. A Contrastive-Augmented Memory Network for Anti-UAV Tracking in TIR Videos (2024)</w:t>
+        <w:t>68. A Contrastive-Augmented Memory Network for Anti-UAV Tracking in TIR Videos (2024)</w:t>
       </w:r>
     </w:p>
     <w:p>
@@ -1769,7 +2073,7 @@
         <w:pStyle w:val="Heading2"/>
       </w:pPr>
       <w:r>
-        <w:t>61. Learning Dynamic Distractor-Repressed Correlation Filter for Real-Time UAV Tracking (2024)</w:t>
+        <w:t>69. Learning Dynamic Distractor-Repressed Correlation Filter for Real-Time UAV Tracking (2024)</w:t>
       </w:r>
     </w:p>
     <w:p>
@@ -1798,7 +2102,7 @@
         <w:pStyle w:val="Heading2"/>
       </w:pPr>
       <w:r>
-        <w:t>62. Lightweight Spatial-Temporal Contextual Aggregation Siamese Network for Unmanned Aerial Vehicle Tracking (2024)</w:t>
+        <w:t>70. Lightweight Spatial-Temporal Contextual Aggregation Siamese Network for Unmanned Aerial Vehicle Tracking (2024)</w:t>
       </w:r>
     </w:p>
     <w:p>
@@ -1827,7 +2131,7 @@
         <w:pStyle w:val="Heading2"/>
       </w:pPr>
       <w:r>
-        <w:t>63. Prompt-Driven Temporal Domain Adaptation for Nighttime UAV Tracking (2024)</w:t>
+        <w:t>71. Prompt-Driven Temporal Domain Adaptation for Nighttime UAV Tracking (2024)</w:t>
       </w:r>
     </w:p>
     <w:p>
@@ -1856,7 +2160,7 @@
         <w:pStyle w:val="Heading2"/>
       </w:pPr>
       <w:r>
-        <w:t>64. SiamHOT: Siamese High-Order Transformer for Aerial Tracking (2024)</w:t>
+        <w:t>72. SiamHOT: Siamese High-Order Transformer for Aerial Tracking (2024)</w:t>
       </w:r>
     </w:p>
     <w:p>
@@ -1885,7 +2189,7 @@
         <w:pStyle w:val="Heading2"/>
       </w:pPr>
       <w:r>
-        <w:t>65. Transformer-Based RGB-T Tracking With Channel and Spatial Feature Fusion (2025)</w:t>
+        <w:t>73. Transformer-Based RGB-T Tracking With Channel and Spatial Feature Fusion (2025)</w:t>
       </w:r>
     </w:p>
     <w:p>
@@ -1914,7 +2218,7 @@
         <w:pStyle w:val="Heading2"/>
       </w:pPr>
       <w:r>
-        <w:t>66. Alleviating Spatial Misalignment and Motion Interference for UAV-based Video Recognition (2023)</w:t>
+        <w:t>74. Alleviating Spatial Misalignment and Motion Interference for UAV-based Video Recognition (2023)</w:t>
       </w:r>
     </w:p>
     <w:p>
@@ -1943,7 +2247,7 @@
         <w:pStyle w:val="Heading2"/>
       </w:pPr>
       <w:r>
-        <w:t>67. FocusTrack: A Self-Adaptive Local Sampling Algorithm for Efficient Anti-UAV Tracking (2025)</w:t>
+        <w:t>75. FocusTrack: A Self-Adaptive Local Sampling Algorithm for Efficient Anti-UAV Tracking (2025)</w:t>
       </w:r>
     </w:p>
     <w:p>
@@ -1972,7 +2276,7 @@
         <w:pStyle w:val="Heading2"/>
       </w:pPr>
       <w:r>
-        <w:t>68. Hierarchical Attention-Enhanced Correlation Refinement for Robust Visual Tracking (2025)</w:t>
+        <w:t>76. Hierarchical Attention-Enhanced Correlation Refinement for Robust Visual Tracking (2025)</w:t>
       </w:r>
     </w:p>
     <w:p>
@@ -2001,7 +2305,7 @@
         <w:pStyle w:val="Heading2"/>
       </w:pPr>
       <w:r>
-        <w:t>69. Learning Distance Constrained Transformation for Video Tracking in Car-Following (2025)</w:t>
+        <w:t>77. Jointly modeling association and motion cues for robust infrared UAV tracking (2024)</w:t>
       </w:r>
     </w:p>
     <w:p>
@@ -2010,6 +2314,44 @@
           <w:i/>
           <w:sz w:val="18"/>
         </w:rPr>
+        <w:t>Boyue Xu, Ruichao Hou, Jia Bei, Tongwei Ren, Gangshan Wu; The Visual Computer</w:t>
+      </w:r>
+      <w:r>
+        <w:rPr>
+          <w:color w:val="1F4E79"/>
+          <w:sz w:val="18"/>
+        </w:rPr>
+        <w:t xml:space="preserve">  |  https://doi.org/10.1007/s00371-023-03245-7</w:t>
+      </w:r>
+    </w:p>
+    <w:p>
+      <w:r>
+        <w:rPr>
+          <w:color w:val="808080"/>
+          <w:sz w:val="16"/>
+        </w:rPr>
+        <w:t>[abstract source: openreview]</w:t>
+      </w:r>
+    </w:p>
+    <w:p>
+      <w:r>
+        <w:t>UAV tracking plays a crucial role in computer vision by enabling real-time monitoring UAVs, enhancing safety and operational capabilities while expanding the potential applications of drone technology. Off-the-shelf deep learning based trackers have not been able to effectively address challenges such as occlusion, complex motion, and background clutter for UAV objects in infrared modality. To overcome these limitations, we propose a novel tracker for UAV object tracking, named MAMC. To be specific, the proposed method first employs a data augmentation strategy to enhance the training dataset. We then introduce a candidate target association matching method to deal with the problem of interference caused by the presence of a large number of similar targets in the infrared pattern. Next, it leverages a motion estimation algorithm with window jitter compensation to address the tracking instability due to background clutter and occlusion. In addition, a simple yet effective object research and update strategy is used to address the complex motion and localization problem of UAV objects. Experimental results demonstrate that the proposed tracker achieves state-of-the-art performance on the Anti-UAV and LSOTB-TIR dataset.</w:t>
+      </w:r>
+    </w:p>
+    <w:p>
+      <w:pPr>
+        <w:pStyle w:val="Heading2"/>
+      </w:pPr>
+      <w:r>
+        <w:t>78. Learning Distance Constrained Transformation for Video Tracking in Car-Following (2025)</w:t>
+      </w:r>
+    </w:p>
+    <w:p>
+      <w:r>
+        <w:rPr>
+          <w:i/>
+          <w:sz w:val="18"/>
+        </w:rPr>
         <w:t>Hao Sun, Yuanming Zhang, Huiyan Zhang, Xuan Qiu, Imre J. Rudas; IEEE Transactions on Cybernetics</w:t>
       </w:r>
       <w:r>
@@ -2030,7 +2372,7 @@
         <w:pStyle w:val="Heading2"/>
       </w:pPr>
       <w:r>
-        <w:t>70. ParallelTracker: A Transformer Based Object Tracker for UAV Videos (2023)</w:t>
+        <w:t>79. ParallelTracker: A Transformer Based Object Tracker for UAV Videos (2023)</w:t>
       </w:r>
     </w:p>
     <w:p>
@@ -2059,7 +2401,7 @@
         <w:pStyle w:val="Heading2"/>
       </w:pPr>
       <w:r>
-        <w:t>71. Real‐time visual tracking design for an unmanned aerial vehicle in cluttered environments (2024)</w:t>
+        <w:t>80. Real‐time visual tracking design for an unmanned aerial vehicle in cluttered environments (2024)</w:t>
       </w:r>
     </w:p>
     <w:p>
@@ -2088,7 +2430,7 @@
         <w:pStyle w:val="Heading2"/>
       </w:pPr>
       <w:r>
-        <w:t>72. STAR: A Unified Spatiotemporal Fusion Framework for Satellite Video Object Tracking (2025)</w:t>
+        <w:t>81. STAR: A Unified Spatiotemporal Fusion Framework for Satellite Video Object Tracking (2025)</w:t>
       </w:r>
     </w:p>
     <w:p>
@@ -2117,7 +2459,7 @@
         <w:pStyle w:val="Heading2"/>
       </w:pPr>
       <w:r>
-        <w:t>73. SiamCTCA: Cross-Temporal Correlation Aggregation Siamese Network for UAV Tracking (2025)</w:t>
+        <w:t>82. Saliency information and mosaic based data augmentation method for densely occluded object recognition (2024)</w:t>
       </w:r>
     </w:p>
     <w:p>
@@ -2126,6 +2468,44 @@
           <w:i/>
           <w:sz w:val="18"/>
         </w:rPr>
+        <w:t>Ying Tong, Xiangfeng Luo, Liyan Ma, Shaorong Xie, Wenbin Yang, Yinsai Guo; Pattern Analysis and Applications</w:t>
+      </w:r>
+      <w:r>
+        <w:rPr>
+          <w:color w:val="1F4E79"/>
+          <w:sz w:val="18"/>
+        </w:rPr>
+        <w:t xml:space="preserve">  |  https://doi.org/10.1007/s10044-024-01258-z</w:t>
+      </w:r>
+    </w:p>
+    <w:p>
+      <w:r>
+        <w:rPr>
+          <w:color w:val="808080"/>
+          <w:sz w:val="16"/>
+        </w:rPr>
+        <w:t>[abstract source: openreview]</w:t>
+      </w:r>
+    </w:p>
+    <w:p>
+      <w:r>
+        <w:t>Data augmentation methods are crucial to improve the accuracy of densely occluded object recognition in the scene where the quantity and diversity of training images are insufficient. However, the current methods that use regional dropping and mixing strategies suffer from the problem of missing foreground objects and redundant background features, which can lead to densely occluded object recognition issues in classification or detection tasks. Herein, saliency information and mosaic based data augmentation method for densely occluded object recognition is proposed, which utilizes saliency information as prior knowledge to supervise the mosaic process of training images containing densely occluded objects. And the method uses fogging processing and class label mixing to construct new augmented images, in order to improve the accuracy of image classification and object recognition tasks by augmenting the quantity and diversity of training images. Extensive experiments on different classification datasets with various CNN architectures prove the effectiveness of our method.</w:t>
+      </w:r>
+    </w:p>
+    <w:p>
+      <w:pPr>
+        <w:pStyle w:val="Heading2"/>
+      </w:pPr>
+      <w:r>
+        <w:t>83. SiamCTCA: Cross-Temporal Correlation Aggregation Siamese Network for UAV Tracking (2025)</w:t>
+      </w:r>
+    </w:p>
+    <w:p>
+      <w:r>
+        <w:rPr>
+          <w:i/>
+          <w:sz w:val="18"/>
+        </w:rPr>
         <w:t>Qiaochu Wang, Faxue Liu, Bao Zhang, Jinghong Liu, Fang Xu, Yulong Wang; Drones</w:t>
       </w:r>
       <w:r>
@@ -2146,7 +2526,7 @@
         <w:pStyle w:val="Heading2"/>
       </w:pPr>
       <w:r>
-        <w:t>74. Transformer tracking with multi-scale dual-attention (2023)</w:t>
+        <w:t>84. Transformer tracking with multi-scale dual-attention (2023)</w:t>
       </w:r>
     </w:p>
     <w:p>
@@ -2175,7 +2555,7 @@
         <w:pStyle w:val="Heading2"/>
       </w:pPr>
       <w:r>
-        <w:t>75. EHTracker: Toward Fine-Grained Localization for Satellite Video Target Tracking (2024)</w:t>
+        <w:t>85. EHTracker: Toward Fine-Grained Localization for Satellite Video Target Tracking (2024)</w:t>
       </w:r>
     </w:p>
     <w:p>
@@ -2204,7 +2584,7 @@
         <w:pStyle w:val="Heading2"/>
       </w:pPr>
       <w:r>
-        <w:t>76. JTD-UAV: MLLM-Enhanced Joint Tracking and Description Framework for Anti-UAV Systems (2025)</w:t>
+        <w:t>86. JTD-UAV: MLLM-Enhanced Joint Tracking and Description Framework for Anti-UAV Systems (2025)</w:t>
       </w:r>
     </w:p>
     <w:p>
@@ -2233,7 +2613,7 @@
         <w:pStyle w:val="Heading2"/>
       </w:pPr>
       <w:r>
-        <w:t>77. Progress and Perspectives on UAV Visual Object Tracking (2025)</w:t>
+        <w:t>87. Progress and Perspectives on UAV Visual Object Tracking (2025)</w:t>
       </w:r>
     </w:p>
     <w:p>
@@ -2262,7 +2642,7 @@
         <w:pStyle w:val="Heading2"/>
       </w:pPr>
       <w:r>
-        <w:t>78. Two-Stage Spatio-Temporal Feature Correlation Network for Infrared Ground Target Tracking (2024)</w:t>
+        <w:t>88. Two-Stage Spatio-Temporal Feature Correlation Network for Infrared Ground Target Tracking (2024)</w:t>
       </w:r>
     </w:p>
     <w:p>
@@ -2291,7 +2671,7 @@
         <w:pStyle w:val="Heading2"/>
       </w:pPr>
       <w:r>
-        <w:t>79. A comparative analysis of near-infrared image colorization methods for low-power NVIDIA Jetson embedded systems (2023)</w:t>
+        <w:t>89. A comparative analysis of near-infrared image colorization methods for low-power NVIDIA Jetson embedded systems (2023)</w:t>
       </w:r>
     </w:p>
     <w:p>
@@ -2320,7 +2700,7 @@
         <w:pStyle w:val="Heading2"/>
       </w:pPr>
       <w:r>
-        <w:t>80. Continuity-Aware Latent Interframe Information Mining for Reliable UAV Tracking (2023)</w:t>
+        <w:t>90. ATFTrans: attention-weighted token fusion transformer for robust and efficient object tracking (2024)</w:t>
       </w:r>
     </w:p>
     <w:p>
@@ -2329,6 +2709,44 @@
           <w:i/>
           <w:sz w:val="18"/>
         </w:rPr>
+        <w:t>Liang Xu, Liejun Wang, Zhiqing Guo; Neural Computing and Applications</w:t>
+      </w:r>
+      <w:r>
+        <w:rPr>
+          <w:color w:val="1F4E79"/>
+          <w:sz w:val="18"/>
+        </w:rPr>
+        <w:t xml:space="preserve">  |  https://doi.org/10.1007/s00521-024-09444-0</w:t>
+      </w:r>
+    </w:p>
+    <w:p>
+      <w:r>
+        <w:rPr>
+          <w:color w:val="808080"/>
+          <w:sz w:val="16"/>
+        </w:rPr>
+        <w:t>[abstract source: openreview]</w:t>
+      </w:r>
+    </w:p>
+    <w:p>
+      <w:r>
+        <w:t>Recently, fully transformer-based trackers have achieved impressive tracking results, but this also brings a great deal of computational complexity. Some researchers have applied token pruning techniques to fully transformer-based trackers to diminish the computational complexity, but this leads to missing contextual information that is important for the regression task in the tracker. In response to the above issue, this paper proposes a token fusion method that speeds up inference while avoiding information loss and thus improving the robustness of the tracker. Specifically, the input of the transformer’s encoder contains search tokens and exemplar tokens, and the search tokens are divided into tracking object tokens and background tokens according to the similarity between search tokens and exemplar tokens. The tokens with greater similarity to the exemplar tokens are identified as tracking object tokens, and those with smaller similarity to the exemplar tokens are identified as background tokens. The tracking object tokens contain the discriminative features of the tracking object, for the sake of making the tracker pay more attention to the tracking object tokens while reducing the computational effort. All the tracking object tokens are kept, and then, the background tokens are weighted and fused to form new background tokens according to the attention weight of the background tokens to prevent the loss of contextual information. The token fusion method presented in this paper not only provides efficient inference of the tracker but also makes the tracker more robust. Extensive experiments are carried out on popular tracking benchmark datasets to verify the validity of the token fusion method.</w:t>
+      </w:r>
+    </w:p>
+    <w:p>
+      <w:pPr>
+        <w:pStyle w:val="Heading2"/>
+      </w:pPr>
+      <w:r>
+        <w:t>91. Continuity-Aware Latent Interframe Information Mining for Reliable UAV Tracking (2023)</w:t>
+      </w:r>
+    </w:p>
+    <w:p>
+      <w:r>
+        <w:rPr>
+          <w:i/>
+          <w:sz w:val="18"/>
+        </w:rPr>
         <w:t>Changhong Fu, Mutian Cai, Sihang Li, Kunhan Lu, Haobo Zuo, Chongjun Liu; Proceedings - IEEE International Conference on Robotics and Automation/Proceedings</w:t>
       </w:r>
       <w:r>
@@ -2349,7 +2767,7 @@
         <w:pStyle w:val="Heading2"/>
       </w:pPr>
       <w:r>
-        <w:t>81. Interframe Saliency Transformer and Lightweight Multidimensional Attention Network for Real-Time Unmanned Aerial Vehicle Tracking (2023)</w:t>
+        <w:t>92. Interframe Saliency Transformer and Lightweight Multidimensional Attention Network for Real-Time Unmanned Aerial Vehicle Tracking (2023)</w:t>
       </w:r>
     </w:p>
     <w:p>
@@ -2378,7 +2796,7 @@
         <w:pStyle w:val="Heading2"/>
       </w:pPr>
       <w:r>
-        <w:t>82. Light Siamese Network for Long-Term Onboard Aerial Tracking (2024)</w:t>
+        <w:t>93. Light Siamese Network for Long-Term Onboard Aerial Tracking (2024)</w:t>
       </w:r>
     </w:p>
     <w:p>
@@ -2407,7 +2825,7 @@
         <w:pStyle w:val="Heading2"/>
       </w:pPr>
       <w:r>
-        <w:t>83. Long-Term Motion-Assisted Remote Sensing Object Tracking (2024)</w:t>
+        <w:t>94. Long-Term Motion-Assisted Remote Sensing Object Tracking (2024)</w:t>
       </w:r>
     </w:p>
     <w:p>
@@ -2436,7 +2854,7 @@
         <w:pStyle w:val="Heading2"/>
       </w:pPr>
       <w:r>
-        <w:t>84. Robust Object Tracking via Long-Range Spatial Representation and Local Feature Enhancement (2025)</w:t>
+        <w:t>95. Robust Object Tracking via Long-Range Spatial Representation and Local Feature Enhancement (2025)</w:t>
       </w:r>
     </w:p>
     <w:p>
@@ -2465,7 +2883,7 @@
         <w:pStyle w:val="Heading2"/>
       </w:pPr>
       <w:r>
-        <w:t>85. SiamTITP: Incorporating Temporal Information and Trajectory Prediction Siamese Network for Satellite Video Object Tracking (2025)</w:t>
+        <w:t>96. SiamTITP: Incorporating Temporal Information and Trajectory Prediction Siamese Network for Satellite Video Object Tracking (2025)</w:t>
       </w:r>
     </w:p>
     <w:p>
@@ -2494,7 +2912,7 @@
         <w:pStyle w:val="Heading2"/>
       </w:pPr>
       <w:r>
-        <w:t>86. Cognitive UAV Tracking: Leveraging DRL and Hybrid Curriculum Learning for Target Reacquisition (2025)</w:t>
+        <w:t>97. Unmanned Aerial Vehicle-based Autonomous Tracking System for Invasive Flying Insects (2024)</w:t>
       </w:r>
     </w:p>
     <w:p>
@@ -2503,6 +2921,44 @@
           <w:i/>
           <w:sz w:val="18"/>
         </w:rPr>
+        <w:t>Jeonghyeon Pak, Bosung Kim, Chanyoung Ju, Hyoung Il Son; Computers and Electronics in Agriculture</w:t>
+      </w:r>
+      <w:r>
+        <w:rPr>
+          <w:color w:val="1F4E79"/>
+          <w:sz w:val="18"/>
+        </w:rPr>
+        <w:t xml:space="preserve">  |  https://doi.org/10.1016/j.compag.2024.109616</w:t>
+      </w:r>
+    </w:p>
+    <w:p>
+      <w:r>
+        <w:rPr>
+          <w:color w:val="808080"/>
+          <w:sz w:val="16"/>
+        </w:rPr>
+        <w:t>[abstract source: crossref-title]</w:t>
+      </w:r>
+    </w:p>
+    <w:p>
+      <w:r>
+        <w:t>Abstract Declining honeybee populations can severely affect agricultural productivity and biodiversity because honeybees provide a crucial ecological service, that is, pollination. The Asian hornet or yellow-legged hornet, Vespa velutina nigrithorax , is a global predator of honeybees ( Apis mellifera L. ) that has become widespread owing to rapid climate change. Given the ecological effect of this invasive alien species, effective management strategies are needed. Herein, we propose a localization system for tracking radio-tagged hornets and discovering hornet hives by combining unmanned aerial vehicles (UAVs) with a trilateration system. By leveraging the homing instinct of hornets, we systematically structured our experiments into a behavioral experiment, ground-truth experiment, and localization experiment. We installed two antennas around apiary premises and an additional antenna mounted on a UAV to track hornets equipped with sensors. According to the experimental results, we successfully discovered the hives of two of the five hornets tested. The average localization error for the first hive was latitude 0.0006(±0.0002) and longitude 0.0023(±0.0015) in decimal degrees. The average localization error for the second hive was latitude 0.0012(±0.0001) and longitude 0.0004(±0.0011) in decimal degrees. Additionally, we thoroughly analyzed the experimental results to obtain insights into hornet behavior and movement patterns. We explored the practicality and scalability of sensor-based tracking methods utilizing UAVs to ascertain their potential for widespread adoption and future advancement. Our study underscores the importance of using innovative technologies to address the ecological challenges posed by invasive species for facilitating ecosystem conservation and management efforts.</w:t>
+      </w:r>
+    </w:p>
+    <w:p>
+      <w:pPr>
+        <w:pStyle w:val="Heading2"/>
+      </w:pPr>
+      <w:r>
+        <w:t>98. Cognitive UAV Tracking: Leveraging DRL and Hybrid Curriculum Learning for Target Reacquisition (2025)</w:t>
+      </w:r>
+    </w:p>
+    <w:p>
+      <w:r>
+        <w:rPr>
+          <w:i/>
+          <w:sz w:val="18"/>
+        </w:rPr>
         <w:t>Jiaqing Wang, Baichuan Zeng, Lan Deng, Ze Ji, Changyun Wei, Zheng Zeng; IEEE Transactions on Automation Science and Engineering</w:t>
       </w:r>
       <w:r>
@@ -2523,7 +2979,7 @@
         <w:pStyle w:val="Heading2"/>
       </w:pPr>
       <w:r>
-        <w:t>87. Cross-Parallel Attention and Efficient Match Transformer for Aerial Tracking (2024)</w:t>
+        <w:t>99. Cross-Parallel Attention and Efficient Match Transformer for Aerial Tracking (2024)</w:t>
       </w:r>
     </w:p>
     <w:p>
@@ -2552,7 +3008,7 @@
         <w:pStyle w:val="Heading2"/>
       </w:pPr>
       <w:r>
-        <w:t>88. DiffTF++: 3D-Aware Diffusion Transformer for Large-Vocabulary 3D Generation (2025)</w:t>
+        <w:t>100. DiffTF++: 3D-Aware Diffusion Transformer for Large-Vocabulary 3D Generation (2025)</w:t>
       </w:r>
     </w:p>
     <w:p>
@@ -2581,7 +3037,7 @@
         <w:pStyle w:val="Heading2"/>
       </w:pPr>
       <w:r>
-        <w:t>89. Efficient Template Distinction Modeling Tracker With Temporal Contexts for Aerial Tracking (2024)</w:t>
+        <w:t>101. Efficient Template Distinction Modeling Tracker With Temporal Contexts for Aerial Tracking (2024)</w:t>
       </w:r>
     </w:p>
     <w:p>
@@ -2610,7 +3066,7 @@
         <w:pStyle w:val="Heading2"/>
       </w:pPr>
       <w:r>
-        <w:t>90. High-Order Temporal Context-Aware Aerial Tracking with Heterogeneous Visual Experts (2025)</w:t>
+        <w:t>102. Enhancing UAV tracking: a focus on discriminative representations using contrastive instances (2024)</w:t>
       </w:r>
     </w:p>
     <w:p>
@@ -2619,6 +3075,44 @@
           <w:i/>
           <w:sz w:val="18"/>
         </w:rPr>
+        <w:t>Xucheng Wang, Dan Zeng, Yongxin Li, Mingliang Zou, Qijun Zhao, Shuiwang Li; Journal of Real-Time Image Processing</w:t>
+      </w:r>
+      <w:r>
+        <w:rPr>
+          <w:color w:val="1F4E79"/>
+          <w:sz w:val="18"/>
+        </w:rPr>
+        <w:t xml:space="preserve">  |  https://doi.org/10.1007/s11554-024-01456-2</w:t>
+      </w:r>
+    </w:p>
+    <w:p>
+      <w:r>
+        <w:rPr>
+          <w:color w:val="808080"/>
+          <w:sz w:val="16"/>
+        </w:rPr>
+        <w:t>[abstract source: openreview]</w:t>
+      </w:r>
+    </w:p>
+    <w:p>
+      <w:r>
+        <w:t>Addressing the core challenges of achieving both high efficiency and precision in UAV tracking is crucial due to limitations in computing resources, battery capacity, and maximum load capacity on UAVs. Discriminative correlation filter (DCF)-based trackers excel in efficiency on a single CPU but lag in precision. In contrast, many lightweight deep learning (DL)-based trackers based on model compression strike a better balance between efficiency and precision. However, higher compression rates can hinder performance by diminishing discriminative representations. Given these challenges, our paper aims to enhance feature representations’ discriminative abilities through an innovative feature-learning approach. We specifically emphasize leveraging contrasting instances to achieve more distinct representations for effective UAV tracking. Our method eliminates the need for manual annotations and facilitates the creation and deployment of lightweight models. As far as our knowledge goes, we are the pioneers in exploring the possibilities of contrastive learning in UAV tracking applications. Through extensive experimentation across four UAV benchmarks, namely, UAVDT, DTB70, UAV123@10fps and VisDrone2018, We have shown that our DRCI (discriminative representation with contrastive instances) tracker outperforms current state-of-the-art UAV tracking methods, underscoring its potential to effectively tackle the persistent challenges in this field.</w:t>
+      </w:r>
+    </w:p>
+    <w:p>
+      <w:pPr>
+        <w:pStyle w:val="Heading2"/>
+      </w:pPr>
+      <w:r>
+        <w:t>103. High-Order Temporal Context-Aware Aerial Tracking with Heterogeneous Visual Experts (2025)</w:t>
+      </w:r>
+    </w:p>
+    <w:p>
+      <w:r>
+        <w:rPr>
+          <w:i/>
+          <w:sz w:val="18"/>
+        </w:rPr>
         <w:t>Shichao Zhou, Xiangpan Fan, Zhuowei Wang, Wenzheng Wang, Yunpu Zhang; Remote Sensing</w:t>
       </w:r>
       <w:r>
@@ -2639,7 +3133,7 @@
         <w:pStyle w:val="Heading2"/>
       </w:pPr>
       <w:r>
-        <w:t>91. Infrared Small Target Tracking Based on OSTrack Model (2023)</w:t>
+        <w:t>104. Infrared Small Target Tracking Based on OSTrack Model (2023)</w:t>
       </w:r>
     </w:p>
     <w:p>
@@ -2668,7 +3162,7 @@
         <w:pStyle w:val="Heading2"/>
       </w:pPr>
       <w:r>
-        <w:t>92. Learning Disentangled Representation with Mutual Information Maximization for Real-Time UAV Tracking (2023)</w:t>
+        <w:t>105. Learning Disentangled Representation with Mutual Information Maximization for Real-Time UAV Tracking (2023)</w:t>
       </w:r>
     </w:p>
     <w:p>
@@ -2697,7 +3191,7 @@
         <w:pStyle w:val="Heading2"/>
       </w:pPr>
       <w:r>
-        <w:t>93. MambaNUT: Nighttime UAV Tracking via Mamba-based Adaptive Curriculum Learning (2025)</w:t>
+        <w:t>106. MambaNUT: Nighttime UAV Tracking via Mamba-based Adaptive Curriculum Learning (2025)</w:t>
       </w:r>
     </w:p>
     <w:p>
@@ -2726,7 +3220,7 @@
         <w:pStyle w:val="Heading2"/>
       </w:pPr>
       <w:r>
-        <w:t>94. SMTN: Multidimensional Fusion and Time-Domain Coding for Object Tracking in Satellite Videos (2023)</w:t>
+        <w:t>107. SMTN: Multidimensional Fusion and Time-Domain Coding for Object Tracking in Satellite Videos (2023)</w:t>
       </w:r>
     </w:p>
     <w:p>
@@ -2755,7 +3249,7 @@
         <w:pStyle w:val="Heading2"/>
       </w:pPr>
       <w:r>
-        <w:t>95. STF: Spatio-Temporal Fusion Module for Improving Video Object Detection (2024)</w:t>
+        <w:t>108. STF: Spatio-Temporal Fusion Module for Improving Video Object Detection (2024)</w:t>
       </w:r>
     </w:p>
     <w:p>
@@ -2784,7 +3278,7 @@
         <w:pStyle w:val="Heading2"/>
       </w:pPr>
       <w:r>
-        <w:t>96. Spatial Context-Aware UAV Target Tracking for Consumer Electronics (2025)</w:t>
+        <w:t>109. Spatial Context-Aware UAV Target Tracking for Consumer Electronics (2025)</w:t>
       </w:r>
     </w:p>
     <w:p>
@@ -2813,7 +3307,7 @@
         <w:pStyle w:val="Heading2"/>
       </w:pPr>
       <w:r>
-        <w:t>97. APR-Net Tracker: Attention Pyramidal Residual Network for Visual Object Tracking (2024)</w:t>
+        <w:t>110. APR-Net Tracker: Attention Pyramidal Residual Network for Visual Object Tracking (2024)</w:t>
       </w:r>
     </w:p>
     <w:p>
@@ -2842,7 +3336,7 @@
         <w:pStyle w:val="Heading2"/>
       </w:pPr>
       <w:r>
-        <w:t>98. CCD-Net: Color-Correction Network Based on Dual-Branch Fusion of Different Color Spaces for Image Dehazing (2025)</w:t>
+        <w:t>111. CCD-Net: Color-Correction Network Based on Dual-Branch Fusion of Different Color Spaces for Image Dehazing (2025)</w:t>
       </w:r>
     </w:p>
     <w:p>
@@ -2871,7 +3365,7 @@
         <w:pStyle w:val="Heading2"/>
       </w:pPr>
       <w:r>
-        <w:t>99. Exploiting Sparse-Temporal Dynamics Via Relevance Networks for UAV Tracking (2026)</w:t>
+        <w:t>112. Exploiting Sparse-Temporal Dynamics Via Relevance Networks for UAV Tracking (2026)</w:t>
       </w:r>
     </w:p>
     <w:p>
@@ -2900,7 +3394,7 @@
         <w:pStyle w:val="Heading2"/>
       </w:pPr>
       <w:r>
-        <w:t>100. Global Multi-Scale Optimization and Prediction Head Attentional Siamese Network for Aerial Tracking (2023)</w:t>
+        <w:t>113. Global Multi-Scale Optimization and Prediction Head Attentional Siamese Network for Aerial Tracking (2023)</w:t>
       </w:r>
     </w:p>
     <w:p>
@@ -2929,7 +3423,7 @@
         <w:pStyle w:val="Heading2"/>
       </w:pPr>
       <w:r>
-        <w:t>101. Language-guided Visual Tracking: Comprehensive and Effective Multimodal Information Fusion (2025)</w:t>
+        <w:t>114. Language-guided Visual Tracking: Comprehensive and Effective Multimodal Information Fusion (2025)</w:t>
       </w:r>
     </w:p>
     <w:p>
@@ -2958,7 +3452,7 @@
         <w:pStyle w:val="Heading2"/>
       </w:pPr>
       <w:r>
-        <w:t>102. Multifrequency Integration and Scale-Frequency Linear Attention for Aerial Tracking (2025)</w:t>
+        <w:t>115. Multifrequency Integration and Scale-Frequency Linear Attention for Aerial Tracking (2025)</w:t>
       </w:r>
     </w:p>
     <w:p>
@@ -2987,7 +3481,7 @@
         <w:pStyle w:val="Heading2"/>
       </w:pPr>
       <w:r>
-        <w:t>103. Spatio-Temporal Feature Aware Vision Transformers for Real-Time Unmanned Aerial Vehicle Tracking (2025)</w:t>
+        <w:t>116. Object tracking based on siamese network with 3D attention and multiple graph attention (2023)</w:t>
       </w:r>
     </w:p>
     <w:p>
@@ -2996,6 +3490,44 @@
           <w:i/>
           <w:sz w:val="18"/>
         </w:rPr>
+        <w:t>Shilei Yan, Yujuan Qi, Mengxue Liu, Yanjiang Wang, Baodi Liu; Computer Vision and Image Understanding</w:t>
+      </w:r>
+      <w:r>
+        <w:rPr>
+          <w:color w:val="1F4E79"/>
+          <w:sz w:val="18"/>
+        </w:rPr>
+        <w:t xml:space="preserve">  |  https://doi.org/10.1016/j.cviu.2023.103786</w:t>
+      </w:r>
+    </w:p>
+    <w:p>
+      <w:r>
+        <w:rPr>
+          <w:color w:val="808080"/>
+          <w:sz w:val="16"/>
+        </w:rPr>
+        <w:t>[abstract source: openreview]</w:t>
+      </w:r>
+    </w:p>
+    <w:p>
+      <w:r>
+        <w:t>Highlights•The proposed algorithm can be trained with a smaller dataset while performing well.•Introducing 3D attention SiamAM improves the accuracy of target feature extraction.•Multiple graph attention improves the accuracy of feature matching and localization.•The evaluations performed on challenging test benchmarks all turn out well.</w:t>
+      </w:r>
+    </w:p>
+    <w:p>
+      <w:pPr>
+        <w:pStyle w:val="Heading2"/>
+      </w:pPr>
+      <w:r>
+        <w:t>117. Spatio-Temporal Feature Aware Vision Transformers for Real-Time Unmanned Aerial Vehicle Tracking (2025)</w:t>
+      </w:r>
+    </w:p>
+    <w:p>
+      <w:r>
+        <w:rPr>
+          <w:i/>
+          <w:sz w:val="18"/>
+        </w:rPr>
         <w:t>Hao Zhang, Hengzhou Ye, Xiaoyu Guo, Xu Zhang, Yao Rong, Shuiwang Li; Drones</w:t>
       </w:r>
       <w:r>
@@ -3016,7 +3548,7 @@
         <w:pStyle w:val="Heading2"/>
       </w:pPr>
       <w:r>
-        <w:t>104. Unambiguous Object Tracking by Exploiting Target Cues (2023)</w:t>
+        <w:t>118. Unambiguous Object Tracking by Exploiting Target Cues (2023)</w:t>
       </w:r>
     </w:p>
     <w:p>
@@ -3045,7 +3577,7 @@
         <w:pStyle w:val="Heading2"/>
       </w:pPr>
       <w:r>
-        <w:t>105. Visual Object Tracking Based on the Motion Prediction and Block Search in UAV Videos (2024)</w:t>
+        <w:t>119. Visual Object Tracking Based on the Motion Prediction and Block Search in UAV Videos (2024)</w:t>
       </w:r>
     </w:p>
     <w:p>
@@ -3074,7 +3606,7 @@
         <w:pStyle w:val="Heading2"/>
       </w:pPr>
       <w:r>
-        <w:t>106. Adaptive and Anti-Drift Motion Constraints for Object Tracking in Satellite Videos (2024)</w:t>
+        <w:t>120. Adaptive and Anti-Drift Motion Constraints for Object Tracking in Satellite Videos (2024)</w:t>
       </w:r>
     </w:p>
     <w:p>
@@ -3103,7 +3635,7 @@
         <w:pStyle w:val="Heading2"/>
       </w:pPr>
       <w:r>
-        <w:t>107. Scale-Adaptive Aerial Object Tracking Network via Location Estimation (2025)</w:t>
+        <w:t>121. Scale-Adaptive Aerial Object Tracking Network via Location Estimation (2025)</w:t>
       </w:r>
     </w:p>
     <w:p>
@@ -3132,7 +3664,7 @@
         <w:pStyle w:val="Heading2"/>
       </w:pPr>
       <w:r>
-        <w:t>108. Separation Fusion Transformer and Efficient Reuse Matching Network for Aerial Tracking (2024)</w:t>
+        <w:t>122. Separation Fusion Transformer and Efficient Reuse Matching Network for Aerial Tracking (2024)</w:t>
       </w:r>
     </w:p>
     <w:p>
@@ -3161,7 +3693,7 @@
         <w:pStyle w:val="Heading2"/>
       </w:pPr>
       <w:r>
-        <w:t>109. SiamFFN: Siamese Feature Fusion Network for Visual Tracking (2023)</w:t>
+        <w:t>123. SiamFFN: Siamese Feature Fusion Network for Visual Tracking (2023)</w:t>
       </w:r>
     </w:p>
     <w:p>
@@ -3190,7 +3722,7 @@
         <w:pStyle w:val="Heading2"/>
       </w:pPr>
       <w:r>
-        <w:t>110. Twofold Structured Features-Based Siamese Network for Infrared Target Tracking (2024)</w:t>
+        <w:t>124. Twofold Structured Features-Based Siamese Network for Infrared Target Tracking (2024)</w:t>
       </w:r>
     </w:p>
     <w:p>
@@ -3219,7 +3751,7 @@
         <w:pStyle w:val="Heading2"/>
       </w:pPr>
       <w:r>
-        <w:t>111. AMST2: aggregated multi-level spatial and temporal context-based transformer for robust aerial tracking (2023)</w:t>
+        <w:t>125. AMST2: aggregated multi-level spatial and temporal context-based transformer for robust aerial tracking (2023)</w:t>
       </w:r>
     </w:p>
     <w:p>
@@ -3248,7 +3780,7 @@
         <w:pStyle w:val="Heading2"/>
       </w:pPr>
       <w:r>
-        <w:t>112. Collaborative Spatiotemporal Anchors and Key Feature Enhancement for UAV Tracking (2026)</w:t>
+        <w:t>126. COST: Contrastive one-stage transformer for vision-language small object tracking (2025)</w:t>
       </w:r>
     </w:p>
     <w:p>
@@ -3257,6 +3789,44 @@
           <w:i/>
           <w:sz w:val="18"/>
         </w:rPr>
+        <w:t>Chunhui Zhang, Li Liu, Jialin Gao, Sun Xin, Hao Wen, Xi Zhou, Shiming Ge, Yanfeng Wang; Information Fusion</w:t>
+      </w:r>
+      <w:r>
+        <w:rPr>
+          <w:color w:val="1F4E79"/>
+          <w:sz w:val="18"/>
+        </w:rPr>
+        <w:t xml:space="preserve">  |  https://doi.org/10.1016/j.inffus.2025.103604</w:t>
+      </w:r>
+    </w:p>
+    <w:p>
+      <w:r>
+        <w:rPr>
+          <w:color w:val="808080"/>
+          <w:sz w:val="16"/>
+        </w:rPr>
+        <w:t>[abstract source: openreview]</w:t>
+      </w:r>
+    </w:p>
+    <w:p>
+      <w:r>
+        <w:t>Transformer has recently demonstrated great potential in improving vision-language (VL) tracking algorithms. However, most of the existing VL trackers rely on carefully designed mechanisms to perform the multi-stage multi-modal fusion. Additionally, direct multi-modal fusion without alignment ignores distribution discrepancy between modalities in feature space, potentially leading to suboptimal representations. In this work, we propose COST, a contrastive one-stage transformer fusion framework for VL tracking, aiming to learn semantically consistent and unified VL representations. Specifically, we introduce a contrastive alignment strategy that maximizes mutual information (MI) between a video and its corresponding language description. This enables effective cross-modal alignment, yielding semantically consistent features in the representation space. By leveraging a visual-linguistic transformer, we establish an efficient multi-modal fusion and reasoning mechanism, empirically demonstrating that a simple stack of transformer encoders effectively enables unified VL representations. Moreover, we contribute a newly collected VL tracking benchmark dataset for small object tracking, named VL-SOT500, with bounding boxes and language descriptions. Our dataset comprises two challenging subsets, VL-SOT230 and VL-SOT270, dedicated to evaluating generic and high-speed small object tracking, respectively. Small object tracking is notoriously challenging due to weak appearance and limited features, and this dataset is, to the best of our knowledge, the first to explore the usage of language cues to enhance visual representation for small object tracking. Extensive experiments demonstrate that COST achieves state-of-the-art performance on five existing VL tracking datasets, as well as on our proposed VL-SOT500 dataset. Source codes and dataset will be made publicly available.</w:t>
+      </w:r>
+    </w:p>
+    <w:p>
+      <w:pPr>
+        <w:pStyle w:val="Heading2"/>
+      </w:pPr>
+      <w:r>
+        <w:t>127. Collaborative Spatiotemporal Anchors and Key Feature Enhancement for UAV Tracking (2026)</w:t>
+      </w:r>
+    </w:p>
+    <w:p>
+      <w:r>
+        <w:rPr>
+          <w:i/>
+          <w:sz w:val="18"/>
+        </w:rPr>
         <w:t>Qiuyu Jin, Yuqi Han, Linbo Tang, Wenzheng Wang, Haotian Sun, Yanhua Wang; IEEE Journal of Selected Topics in Applied Earth Observations and Remote Sensing</w:t>
       </w:r>
       <w:r>
@@ -3277,7 +3847,7 @@
         <w:pStyle w:val="Heading2"/>
       </w:pPr>
       <w:r>
-        <w:t>113. Contextual Enhancement–Interaction and Multi-Scale Weighted Fusion Network for Aerial Tracking (2024)</w:t>
+        <w:t>128. Contextual Enhancement–Interaction and Multi-Scale Weighted Fusion Network for Aerial Tracking (2024)</w:t>
       </w:r>
     </w:p>
     <w:p>
@@ -3306,7 +3876,7 @@
         <w:pStyle w:val="Heading2"/>
       </w:pPr>
       <w:r>
-        <w:t>114. Dynamic Spatiotemporal Information Interaction for Multidrone Single Object Tracking (2026)</w:t>
+        <w:t>129. Dynamic Spatiotemporal Information Interaction for Multidrone Single Object Tracking (2026)</w:t>
       </w:r>
     </w:p>
     <w:p>
@@ -3335,7 +3905,7 @@
         <w:pStyle w:val="Heading2"/>
       </w:pPr>
       <w:r>
-        <w:t>115. EMTrack: Event-Guide Multimodal Transformer for Challenging Single-Object Tracking (2025)</w:t>
+        <w:t>130. EMTrack: Event-Guide Multimodal Transformer for Challenging Single-Object Tracking (2025)</w:t>
       </w:r>
     </w:p>
     <w:p>
@@ -3364,7 +3934,7 @@
         <w:pStyle w:val="Heading2"/>
       </w:pPr>
       <w:r>
-        <w:t>116. Knowledge text-guided frequency-spatial multi-scale feature fusion and collaborative relationship learning for UAV tracking (2025)</w:t>
+        <w:t>131. Knowledge text-guided frequency-spatial multi-scale feature fusion and collaborative relationship learning for UAV tracking (2025)</w:t>
       </w:r>
     </w:p>
     <w:p>
@@ -3393,7 +3963,7 @@
         <w:pStyle w:val="Heading2"/>
       </w:pPr>
       <w:r>
-        <w:t>117. Low-Light Object Tracking: A Benchmark (2025)</w:t>
+        <w:t>132. Low-Light Object Tracking: A Benchmark (2025)</w:t>
       </w:r>
     </w:p>
     <w:p>
@@ -3422,7 +3992,7 @@
         <w:pStyle w:val="Heading2"/>
       </w:pPr>
       <w:r>
-        <w:t>118. PACR: Pixel Attention in Classification and Regression for Visual Object Tracking (2023)</w:t>
+        <w:t>133. PACR: Pixel Attention in Classification and Regression for Visual Object Tracking (2023)</w:t>
       </w:r>
     </w:p>
     <w:p>
@@ -3451,7 +4021,7 @@
         <w:pStyle w:val="Heading2"/>
       </w:pPr>
       <w:r>
-        <w:t>119. Robust UAV Tracking via Information Synergy Fusion and Multi-Dimensional Spatial Perception (2025)</w:t>
+        <w:t>134. Robust UAV Tracking via Information Synergy Fusion and Multi-Dimensional Spatial Perception (2025)</w:t>
       </w:r>
     </w:p>
     <w:p>
@@ -3480,7 +4050,7 @@
         <w:pStyle w:val="Heading2"/>
       </w:pPr>
       <w:r>
-        <w:t>120. SiamTADT: A Task-Aware Drone Tracker for Aerial Autonomous Vehicles (2024)</w:t>
+        <w:t>135. SiamTADT: A Task-Aware Drone Tracker for Aerial Autonomous Vehicles (2024)</w:t>
       </w:r>
     </w:p>
     <w:p>
@@ -3509,7 +4079,7 @@
         <w:pStyle w:val="Heading2"/>
       </w:pPr>
       <w:r>
-        <w:t>121. Siamese network with a depthwise over-parameterized convolutional layer for visual tracking (2022)</w:t>
+        <w:t>136. Siamese network with a depthwise over-parameterized convolutional layer for visual tracking (2022)</w:t>
       </w:r>
     </w:p>
     <w:p>
@@ -3538,7 +4108,7 @@
         <w:pStyle w:val="Heading2"/>
       </w:pPr>
       <w:r>
-        <w:t>122. TFITrack: Transformer Feature Integration Network for Object Tracking (2024)</w:t>
+        <w:t>137. TFITrack: Transformer Feature Integration Network for Object Tracking (2024)</w:t>
       </w:r>
     </w:p>
     <w:p>
@@ -3567,7 +4137,7 @@
         <w:pStyle w:val="Heading2"/>
       </w:pPr>
       <w:r>
-        <w:t>123. Towards Real-World Aerial Vision Guidance With Categorical 6D Pose Tracker (2025)</w:t>
+        <w:t>138. Towards Real-World Aerial Vision Guidance With Categorical 6D Pose Tracker (2025)</w:t>
       </w:r>
     </w:p>
     <w:p>
@@ -3596,7 +4166,7 @@
         <w:pStyle w:val="Heading2"/>
       </w:pPr>
       <w:r>
-        <w:t>124. A Two-Stage Method for Aerial Tracking in Adverse Weather Conditions (2024)</w:t>
+        <w:t>139. A Two-Stage Method for Aerial Tracking in Adverse Weather Conditions (2024)</w:t>
       </w:r>
     </w:p>
     <w:p>
@@ -3625,7 +4195,7 @@
         <w:pStyle w:val="Heading2"/>
       </w:pPr>
       <w:r>
-        <w:t>125. A robust RGBT tracking framework with temporal information enhancement and backward trajectory verification (2025)</w:t>
+        <w:t>140. A robust RGBT tracking framework with temporal information enhancement and backward trajectory verification (2025)</w:t>
       </w:r>
     </w:p>
     <w:p>
@@ -3654,7 +4224,7 @@
         <w:pStyle w:val="Heading2"/>
       </w:pPr>
       <w:r>
-        <w:t>126. Adapting Visual Trackers to Dynamic View Transitions With Shift-View Prompt Tuning (2026)</w:t>
+        <w:t>141. Adapting Visual Trackers to Dynamic View Transitions With Shift-View Prompt Tuning (2026)</w:t>
       </w:r>
     </w:p>
     <w:p>
@@ -3683,7 +4253,7 @@
         <w:pStyle w:val="Heading2"/>
       </w:pPr>
       <w:r>
-        <w:t>127. Aerial tracking of camouflaged people in woodlands (2023)</w:t>
+        <w:t>142. Aerial tracking of camouflaged people in woodlands (2023)</w:t>
       </w:r>
     </w:p>
     <w:p>
@@ -3712,7 +4282,7 @@
         <w:pStyle w:val="Heading2"/>
       </w:pPr>
       <w:r>
-        <w:t>128. Assisting RGB and depth salient object detection with nonconvolutional encoder: an improvement approach (2024)</w:t>
+        <w:t>143. Assisting RGB and depth salient object detection with nonconvolutional encoder: an improvement approach (2024)</w:t>
       </w:r>
     </w:p>
     <w:p>
@@ -3741,7 +4311,7 @@
         <w:pStyle w:val="Heading2"/>
       </w:pPr>
       <w:r>
-        <w:t>129. Benchmarking the Robustness of UAV Tracking Against Common Corruptions (2024)</w:t>
+        <w:t>144. Benchmarking the Robustness of UAV Tracking Against Common Corruptions (2024)</w:t>
       </w:r>
     </w:p>
     <w:p>
@@ -3770,7 +4340,7 @@
         <w:pStyle w:val="Heading2"/>
       </w:pPr>
       <w:r>
-        <w:t>130. Beyond Stepwise Modeling: Toward a Unified Contextual Reasoning Framework for Hyperspectral Video Object Tracking (2026)</w:t>
+        <w:t>145. Beyond Stepwise Modeling: Toward a Unified Contextual Reasoning Framework for Hyperspectral Video Object Tracking (2026)</w:t>
       </w:r>
     </w:p>
     <w:p>
@@ -3799,7 +4369,7 @@
         <w:pStyle w:val="Heading2"/>
       </w:pPr>
       <w:r>
-        <w:t>131. CGTrack: Cascade Gating Network with Hierarchical Feature Aggregation for UAV Tracking (2025)</w:t>
+        <w:t>146. CGTrack: Cascade Gating Network with Hierarchical Feature Aggregation for UAV Tracking (2025)</w:t>
       </w:r>
     </w:p>
     <w:p>
@@ -3828,7 +4398,7 @@
         <w:pStyle w:val="Heading2"/>
       </w:pPr>
       <w:r>
-        <w:t>132. Click&amp;Describe: Multimodal Grounding and Tracking for Aerial Objects (2025)</w:t>
+        <w:t>147. Click&amp;Describe: Multimodal Grounding and Tracking for Aerial Objects (2025)</w:t>
       </w:r>
     </w:p>
     <w:p>
@@ -3857,7 +4427,7 @@
         <w:pStyle w:val="Heading2"/>
       </w:pPr>
       <w:r>
-        <w:t>133. Cognitive embodied learning for anomaly active target tracking (2025)</w:t>
+        <w:t>148. Cognitive embodied learning for anomaly active target tracking (2025)</w:t>
       </w:r>
     </w:p>
     <w:p>
@@ -3886,7 +4456,7 @@
         <w:pStyle w:val="Heading2"/>
       </w:pPr>
       <w:r>
-        <w:t>134. Consistent Weighted Correlation-Based Attention for Transformer Tracking (2023)</w:t>
+        <w:t>149. Consistent Weighted Correlation-Based Attention for Transformer Tracking (2023)</w:t>
       </w:r>
     </w:p>
     <w:p>
@@ -3915,7 +4485,7 @@
         <w:pStyle w:val="Heading2"/>
       </w:pPr>
       <w:r>
-        <w:t>135. Continuously Learning Video-level Object Tokens for Robust UAV tracking (2025)</w:t>
+        <w:t>150. Continuously Learning Video-level Object Tokens for Robust UAV tracking (2025)</w:t>
       </w:r>
     </w:p>
     <w:p>
@@ -3944,7 +4514,7 @@
         <w:pStyle w:val="Heading2"/>
       </w:pPr>
       <w:r>
-        <w:t>136. Dynamic Compact Consensus Tracking for Aerial Robots (2025)</w:t>
+        <w:t>151. Dynamic Compact Consensus Tracking for Aerial Robots (2025)</w:t>
       </w:r>
     </w:p>
     <w:p>
@@ -3973,7 +4543,7 @@
         <w:pStyle w:val="Heading2"/>
       </w:pPr>
       <w:r>
-        <w:t>137. Improvement of Remote Sensing Target Tracking Method Based on Deep Learnin (2025)</w:t>
+        <w:t>152. Improvement of Remote Sensing Target Tracking Method Based on Deep Learnin (2025)</w:t>
       </w:r>
     </w:p>
     <w:p>
@@ -4002,7 +4572,7 @@
         <w:pStyle w:val="Heading2"/>
       </w:pPr>
       <w:r>
-        <w:t>138. Lightweight Anti-UAV Object Tracking With Visual Sensing Based on Heterogeneous Model Knowledge Distillation (2025)</w:t>
+        <w:t>153. Lightweight Anti-UAV Object Tracking With Visual Sensing Based on Heterogeneous Model Knowledge Distillation (2025)</w:t>
       </w:r>
     </w:p>
     <w:p>
@@ -4031,7 +4601,7 @@
         <w:pStyle w:val="Heading2"/>
       </w:pPr>
       <w:r>
-        <w:t>139. Motion-Appearance Synergistic Dual-Branch Joint Decision for Airborne Infrared Multi-Object Tracking (2026)</w:t>
+        <w:t>154. Motion-Appearance Synergistic Dual-Branch Joint Decision for Airborne Infrared Multi-Object Tracking (2026)</w:t>
       </w:r>
     </w:p>
     <w:p>
@@ -4060,7 +4630,7 @@
         <w:pStyle w:val="Heading2"/>
       </w:pPr>
       <w:r>
-        <w:t>140. Multi-Source Templates Learning for Real-Time Aerial Tracking (2023)</w:t>
+        <w:t>155. Multi-Source Templates Learning for Real-Time Aerial Tracking (2023)</w:t>
       </w:r>
     </w:p>
     <w:p>
@@ -4089,7 +4659,7 @@
         <w:pStyle w:val="Heading2"/>
       </w:pPr>
       <w:r>
-        <w:t>141. Performance Benchmarking of Visual Human Tracking Algorithms for UAVs (2022)</w:t>
+        <w:t>156. Paf-tracker: a novel pre-frame auxiliary and fusion visual tracker (2024)</w:t>
       </w:r>
     </w:p>
     <w:p>
@@ -4098,6 +4668,44 @@
           <w:i/>
           <w:sz w:val="18"/>
         </w:rPr>
+        <w:t>Wei Fang Liang, Derui Ding, Hui Yu; Machine Learning</w:t>
+      </w:r>
+      <w:r>
+        <w:rPr>
+          <w:color w:val="1F4E79"/>
+          <w:sz w:val="18"/>
+        </w:rPr>
+        <w:t xml:space="preserve">  |  https://doi.org/10.1007/s10994-023-06466-y</w:t>
+      </w:r>
+    </w:p>
+    <w:p>
+      <w:r>
+        <w:rPr>
+          <w:color w:val="808080"/>
+          <w:sz w:val="16"/>
+        </w:rPr>
+        <w:t>[abstract source: openreview]</w:t>
+      </w:r>
+    </w:p>
+    <w:p>
+      <w:r>
+        <w:t>Relying on a large amount of data, recent object trackers achieve superior performance. However Siamese-like trackers expose considerable shortcomings in the case of brief occlusion. To address these shortages, the paper proposes a novel pre-frame auxiliary and fusion tracking framework. Within this framework, a retained variable is first introduced to avoid some additional twin branches while retaining the previously obtained deep features of the search frames. Based on such a variable, a pre-frame auxiliary module is constructed to establish the relationship between encoding features and the retained pre-frame information and a decoding fusion module is designed to fuse the generated similarity relationship. Moreover, the Efficient IoU (EIoU) loss is employed to increase the precision of predicted bounding boxes by adding three penalty terms for the differences in the center point, length, and width of the two bounding boxes. Finally, the superiority over state-of-the-art methods is verified by numerous tests on visual tracking benchmarks.</w:t>
+      </w:r>
+    </w:p>
+    <w:p>
+      <w:pPr>
+        <w:pStyle w:val="Heading2"/>
+      </w:pPr>
+      <w:r>
+        <w:t>157. Performance Benchmarking of Visual Human Tracking Algorithms for UAVs (2022)</w:t>
+      </w:r>
+    </w:p>
+    <w:p>
+      <w:r>
+        <w:rPr>
+          <w:i/>
+          <w:sz w:val="18"/>
+        </w:rPr>
         <w:t>Τheofanis Kalampokas, George A. Papakostas, Vassilios Chatzis, Stelios Krinidis; Panhellenic Conference on Informatics</w:t>
       </w:r>
       <w:r>
@@ -4118,7 +4726,7 @@
         <w:pStyle w:val="Heading2"/>
       </w:pPr>
       <w:r>
-        <w:t>142. RCFT: re-parameterization convolution and feature filter for object tracking (2023)</w:t>
+        <w:t>158. RCFT: re-parameterization convolution and feature filter for object tracking (2023)</w:t>
       </w:r>
     </w:p>
     <w:p>
@@ -4147,7 +4755,7 @@
         <w:pStyle w:val="Heading2"/>
       </w:pPr>
       <w:r>
-        <w:t>143. RainyTrack: Enhancing Object Tracking in Adverse Weather Conditions with Siamese Networks (2024)</w:t>
+        <w:t>159. RainyTrack: Enhancing Object Tracking in Adverse Weather Conditions with Siamese Networks (2024)</w:t>
       </w:r>
     </w:p>
     <w:p>
@@ -4176,7 +4784,7 @@
         <w:pStyle w:val="Heading2"/>
       </w:pPr>
       <w:r>
-        <w:t>144. Robust Active Target Tracking via Constrained Policy Optimization in Partially Observable Environments (2024)</w:t>
+        <w:t>160. Robust Active Target Tracking via Constrained Policy Optimization in Partially Observable Environments (2024)</w:t>
       </w:r>
     </w:p>
     <w:p>
@@ -4205,7 +4813,7 @@
         <w:pStyle w:val="Heading2"/>
       </w:pPr>
       <w:r>
-        <w:t>145. SSiamTrack: Infrared Target Tracking via Spatiotemporal Siamese Network (2025)</w:t>
+        <w:t>161. SSiamTrack: Infrared Target Tracking via Spatiotemporal Siamese Network (2025)</w:t>
       </w:r>
     </w:p>
     <w:p>
@@ -4234,7 +4842,7 @@
         <w:pStyle w:val="Heading2"/>
       </w:pPr>
       <w:r>
-        <w:t>146. SiamTAR: Enhancing Object Tracking With Joint Template Updating and Relocation Mechanisms (2024)</w:t>
+        <w:t>162. SiamTAR: Enhancing Object Tracking With Joint Template Updating and Relocation Mechanisms (2024)</w:t>
       </w:r>
     </w:p>
     <w:p>
@@ -4263,7 +4871,7 @@
         <w:pStyle w:val="Heading2"/>
       </w:pPr>
       <w:r>
-        <w:t>147. TIFTrack: Visual Object Tracking by Target Trajectory and Inter Frame Relationship (2025)</w:t>
+        <w:t>163. TIFTrack: Visual Object Tracking by Target Trajectory and Inter Frame Relationship (2025)</w:t>
       </w:r>
     </w:p>
     <w:p>
@@ -4292,7 +4900,7 @@
         <w:pStyle w:val="Heading2"/>
       </w:pPr>
       <w:r>
-        <w:t>148. TPC-Tracker: A Tracker-Predictor Correlation Framework for Latency Compensation in Aerial Tracking (2026)</w:t>
+        <w:t>164. TPC-Tracker: A Tracker-Predictor Correlation Framework for Latency Compensation in Aerial Tracking (2026)</w:t>
       </w:r>
     </w:p>
     <w:p>
@@ -4321,7 +4929,7 @@
         <w:pStyle w:val="Heading2"/>
       </w:pPr>
       <w:r>
-        <w:t>149. Toward Real-Time UAV Tracking With Adaptive and Background-Aware Vision Transformers (2026)</w:t>
+        <w:t>165. Toward Real-Time UAV Tracking With Adaptive and Background-Aware Vision Transformers (2026)</w:t>
       </w:r>
     </w:p>
     <w:p>
@@ -4350,7 +4958,7 @@
         <w:pStyle w:val="Heading2"/>
       </w:pPr>
       <w:r>
-        <w:t>150. Universal Low-Frequency Noise Black-Box Attack on Visual Object Tracking (2025)</w:t>
+        <w:t>166. Tracking Reflected Objects: A Benchmark (2024)</w:t>
       </w:r>
     </w:p>
     <w:p>
@@ -4359,6 +4967,82 @@
           <w:i/>
           <w:sz w:val="18"/>
         </w:rPr>
+        <w:t>Xiaoyu Guo, Pengzhi Zhong, Lizhi Lin, Hao Zhang, Ling Huang, Shuiwang Li; Lecture notes in computer science</w:t>
+      </w:r>
+      <w:r>
+        <w:rPr>
+          <w:color w:val="1F4E79"/>
+          <w:sz w:val="18"/>
+        </w:rPr>
+        <w:t xml:space="preserve">  |  https://doi.org/10.1007/978-981-96-0901-7_21</w:t>
+      </w:r>
+    </w:p>
+    <w:p>
+      <w:r>
+        <w:rPr>
+          <w:color w:val="808080"/>
+          <w:sz w:val="16"/>
+        </w:rPr>
+        <w:t>[abstract source: openreview]</w:t>
+      </w:r>
+    </w:p>
+    <w:p>
+      <w:r>
+        <w:t>Visual tracking has advanced significantly in recent years, mainly due to the availability of large-scale training datasets. These datasets have enabled the development of numerous algorithms that can track objects with high accuracy and robustness.However, the majority of current research has been directed towards tracking generic objects, with less emphasis on more specialized and challenging scenarios. One such challenging scenario involves tracking reflected objects. Reflections can significantly distort the appearance of objects, creating ambiguous visual cues that complicate the tracking process. This issue is particularly pertinent in applications such as autonomous driving, security, smart homes, and industrial production, where accurately tracking objects reflected in surfaces like mirrors or glass is crucial. To address this gap, we introduce TRO, a benchmark specifically for Tracking Reflected Objects. TRO includes 200 sequences with around 70,000 frames, each carefully annotated with bounding boxes. This dataset aims to encourage the development of new, accurate methods for tracking reflected objects, which present unique challenges not sufficiently covered by existing benchmarks. We evaluated 20 state-of-the-art trackers and found that they struggle with the complexities of reflections. To provide a stronger baseline, we propose a new tracker, HiP-HaTrack, which uses hierarchical features to improve performance, significantly outperforming existing algorithms. We believe our benchmark, evaluation, and HiP-HaTrack will inspire further research and applications in tracking reflected objects. The TRO and code are available at https://github.com/OpenCodeGithub/HIP-HaTrack.</w:t>
+      </w:r>
+    </w:p>
+    <w:p>
+      <w:pPr>
+        <w:pStyle w:val="Heading2"/>
+      </w:pPr>
+      <w:r>
+        <w:t>167. UAV Cross-Modal Image Registration: Large-Scale Dataset and Transformer-Based Approach (2024)</w:t>
+      </w:r>
+    </w:p>
+    <w:p>
+      <w:r>
+        <w:rPr>
+          <w:i/>
+          <w:sz w:val="18"/>
+        </w:rPr>
+        <w:t>Yun Hua Xiao, Fei Liu, Yabin Zhu, Chenglong Li, Futian Wang, Jin Tang; Lecture notes in computer science</w:t>
+      </w:r>
+      <w:r>
+        <w:rPr>
+          <w:color w:val="1F4E79"/>
+          <w:sz w:val="18"/>
+        </w:rPr>
+        <w:t xml:space="preserve">  |  https://doi.org/10.1007/978-981-97-1417-9_16</w:t>
+      </w:r>
+    </w:p>
+    <w:p>
+      <w:r>
+        <w:rPr>
+          <w:color w:val="808080"/>
+          <w:sz w:val="16"/>
+        </w:rPr>
+        <w:t>[abstract source: openreview]</w:t>
+      </w:r>
+    </w:p>
+    <w:p>
+      <w:r>
+        <w:t>It is common to equip unmanned aerial vehicle (UAV) with visible-thermal infrared cameras to enable them to operate around the clock under any weather conditions. However, these two cameras often encounter significant non-registration issues. Multimodal methods depend on registered data, whereas current platforms often lack registration. This absence of registration renders the data unusable for these methods. Thus, there is a pressing need for research on UAV cross-modal image registration. At present, a scarcity of datasets has limited the development of this area. For this reason, we construct a dataset for visible infrared image registration (UAV-VIIR), which consists of 5560 image pairs. The dataset has five additional challenges including low-light, low-texture, foggy weather, motion blur, and thermal crossover. Furthermore, the dataset covers more than a dozen diverse and complex UAV scences. As far as our knowledge extends, this dataset ranks among the largest open-source collections available in this field. Additionally, we propose a transformer-based homography estimation network (THENet), which incorporates a cross-enhanced transformer module and effectively enhances the features of different modalities. Extensive experiments are conducted on our proposed dataset to demonstrate the superiority and effectiveness of our approach compared to state-of-the-art methods.</w:t>
+      </w:r>
+    </w:p>
+    <w:p>
+      <w:pPr>
+        <w:pStyle w:val="Heading2"/>
+      </w:pPr>
+      <w:r>
+        <w:t>168. Universal Low-Frequency Noise Black-Box Attack on Visual Object Tracking (2025)</w:t>
+      </w:r>
+    </w:p>
+    <w:p>
+      <w:r>
+        <w:rPr>
+          <w:i/>
+          <w:sz w:val="18"/>
+        </w:rPr>
         <w:t>Hanting Hou, Huan Bao, Kaimin Wei, Yongdong Wu; Symmetry</w:t>
       </w:r>
       <w:r>
@@ -4379,7 +5063,7 @@
         <w:pStyle w:val="Heading2"/>
       </w:pPr>
       <w:r>
-        <w:t>151. A Geometric Distortion Correction Method for UAV Projection in Non-Planar Scenarios (2025)</w:t>
+        <w:t>169. A Geometric Distortion Correction Method for UAV Projection in Non-Planar Scenarios (2025)</w:t>
       </w:r>
     </w:p>
     <w:p>
@@ -4408,7 +5092,7 @@
         <w:pStyle w:val="Heading2"/>
       </w:pPr>
       <w:r>
-        <w:t>152. A Hybrid Closed-Loop Tracker Fusing a Kalman Filter State Observer for Fast and Robust Embedded Visual Tracking (2026)</w:t>
+        <w:t>170. A Hybrid Closed-Loop Tracker Fusing a Kalman Filter State Observer for Fast and Robust Embedded Visual Tracking (2026)</w:t>
       </w:r>
     </w:p>
     <w:p>
@@ -4437,7 +5121,7 @@
         <w:pStyle w:val="Heading2"/>
       </w:pPr>
       <w:r>
-        <w:t>153. A Novel Expert-Assisted Anomaly-Aware Embodied Learning Framework for UAV Active Target Tracking (2026)</w:t>
+        <w:t>171. A Novel Expert-Assisted Anomaly-Aware Embodied Learning Framework for UAV Active Target Tracking (2026)</w:t>
       </w:r>
     </w:p>
     <w:p>
@@ -4466,7 +5150,7 @@
         <w:pStyle w:val="Heading2"/>
       </w:pPr>
       <w:r>
-        <w:t>154. AS-SAM2: Adaptive Self-Correction for Visual Tracking With SAM2 (2026)</w:t>
+        <w:t>172. A lightweight target detection method for pressure sensitive paint marker points (2026)</w:t>
       </w:r>
     </w:p>
     <w:p>
@@ -4475,6 +5159,44 @@
           <w:i/>
           <w:sz w:val="18"/>
         </w:rPr>
+        <w:t>Yuning Li, Xianhui Liao, Hui Li</w:t>
+      </w:r>
+      <w:r>
+        <w:rPr>
+          <w:color w:val="1F4E79"/>
+          <w:sz w:val="18"/>
+        </w:rPr>
+        <w:t xml:space="preserve">  |  https://doi.org/10.1145/3829641.3829699</w:t>
+      </w:r>
+    </w:p>
+    <w:p>
+      <w:r>
+        <w:rPr>
+          <w:color w:val="808080"/>
+          <w:sz w:val="16"/>
+        </w:rPr>
+        <w:t>[abstract source: semanticscholar]</w:t>
+      </w:r>
+    </w:p>
+    <w:p>
+      <w:r>
+        <w:t>Pressure sensitive paint (PSP) image marker point detection is a crucial step in the post-processing of flow field pressure measurement data, which directly determines the accuracy of image registration and the overall measurement efficiency. To address the existing trade-off dilemma among real-time performance, detection accuracy and computational cost in PSP image marker point detection, as well as the lack of dedicated datasets for this specific task, a lightweight marker point detection algorithm named PSPCMU-YOLO is proposed. Firstly, PSP image acquisition and annotation for a flight wing model are conducted to construct the FlyWing-PSP2025 dedicated dataset, which enriches the specialized data resources in this research field. Secondly, the detection layer structure of the baseline algorithm is reconfigured, strengthening the capture of shallow small-target features and alleviating the problem of loss of detailed information in the deep network. Finally, the CMUNeXt Block is introduced to the backbone network to replace the standard convolution, achieving efficient extraction of global information through large-kernel depthwise separable convolution, and simplifying the model parameters. Experimental verification shows that this algorithm effectively reduces the computational cost while guaranteeing high accuracy in marker point detection, which meeting the requirements of lightweight deployment and providing reliable support for the engineering application of PSP measurement technology.</w:t>
+      </w:r>
+    </w:p>
+    <w:p>
+      <w:pPr>
+        <w:pStyle w:val="Heading2"/>
+      </w:pPr>
+      <w:r>
+        <w:t>173. AS-SAM2: Adaptive Self-Correction for Visual Tracking With SAM2 (2026)</w:t>
+      </w:r>
+    </w:p>
+    <w:p>
+      <w:r>
+        <w:rPr>
+          <w:i/>
+          <w:sz w:val="18"/>
+        </w:rPr>
         <w:t>Tao Lv, Shenrun Ding, Yuji Wang, Yue Li, Xiaohuan Lu, Youliang Tian; IEEE Transactions on Circuits and Systems for Video Technology</w:t>
       </w:r>
       <w:r>
@@ -4495,7 +5217,7 @@
         <w:pStyle w:val="Heading2"/>
       </w:pPr>
       <w:r>
-        <w:t>155. Adaptive Continual Learning for Online Visual Object Tracking via Dynamic Grassmannian Appearance Modeling (2026)</w:t>
+        <w:t>174. Adaptive Continual Learning for Online Visual Object Tracking via Dynamic Grassmannian Appearance Modeling (2026)</w:t>
       </w:r>
     </w:p>
     <w:p>
@@ -4524,7 +5246,7 @@
         <w:pStyle w:val="Heading2"/>
       </w:pPr>
       <w:r>
-        <w:t>156. Adaptive Feature- and Scale-Based Object Tracking with Correlation Filters for Resource-Constrained End Devices in the IoT (2025)</w:t>
+        <w:t>175. Adaptive Feature- and Scale-Based Object Tracking with Correlation Filters for Resource-Constrained End Devices in the IoT (2025)</w:t>
       </w:r>
     </w:p>
     <w:p>
@@ -4553,7 +5275,7 @@
         <w:pStyle w:val="Heading2"/>
       </w:pPr>
       <w:r>
-        <w:t>157. Aerial Visual Tracking using Multi-level Temporal Contexts Information (2022)</w:t>
+        <w:t>176. Aerial Visual Tracking using Multi-level Temporal Contexts Information (2022)</w:t>
       </w:r>
     </w:p>
     <w:p>
@@ -4582,7 +5304,7 @@
         <w:pStyle w:val="Heading2"/>
       </w:pPr>
       <w:r>
-        <w:t>158. Anti-Occlusion Scale-Adaptive Correlation Tracking (2024)</w:t>
+        <w:t>177. Anti-Occlusion Scale-Adaptive Correlation Tracking (2024)</w:t>
       </w:r>
     </w:p>
     <w:p>
@@ -4611,7 +5333,7 @@
         <w:pStyle w:val="Heading2"/>
       </w:pPr>
       <w:r>
-        <w:t>159. AviAnalyzer: Interactive Temporal Analysis for Aircraft Flight Anomaly Detection (2025)</w:t>
+        <w:t>178. AviAnalyzer: Interactive Temporal Analysis for Aircraft Flight Anomaly Detection (2025)</w:t>
       </w:r>
     </w:p>
     <w:p>
@@ -4640,7 +5362,7 @@
         <w:pStyle w:val="Heading2"/>
       </w:pPr>
       <w:r>
-        <w:t>160. Banshee: Target Switch Attacks on Gimbal-Stabilized Visual Tracking Systems via Acoustic Injection (2026)</w:t>
+        <w:t>179. Banshee: Target Switch Attacks on Gimbal-Stabilized Visual Tracking Systems via Acoustic Injection (2026)</w:t>
       </w:r>
     </w:p>
     <w:p>
@@ -4669,7 +5391,7 @@
         <w:pStyle w:val="Heading2"/>
       </w:pPr>
       <w:r>
-        <w:t>161. CLAT: Convolutional Local Attention Tracker for Real-time UAV Target Tracking System with Feedback Information (2024)</w:t>
+        <w:t>180. CLAT: Convolutional Local Attention Tracker for Real-time UAV Target Tracking System with Feedback Information (2024)</w:t>
       </w:r>
     </w:p>
     <w:p>
@@ -4698,7 +5420,7 @@
         <w:pStyle w:val="Heading2"/>
       </w:pPr>
       <w:r>
-        <w:t>162. Correlation filter learning with dual-modal motion fusion and total variation for UAV tracking (2026)</w:t>
+        <w:t>181. Correlation filter learning with dual-modal motion fusion and total variation for UAV tracking (2026)</w:t>
       </w:r>
     </w:p>
     <w:p>
@@ -4727,7 +5449,7 @@
         <w:pStyle w:val="Heading2"/>
       </w:pPr>
       <w:r>
-        <w:t>163. Detection of Anatomical Structures and Lesions in Hand Surgery Through the Use of Artificial Intelligence (2024)</w:t>
+        <w:t>182. Customizing the feature modulation for visual tracking (2023)</w:t>
       </w:r>
     </w:p>
     <w:p>
@@ -4736,6 +5458,44 @@
           <w:i/>
           <w:sz w:val="18"/>
         </w:rPr>
+        <w:t>Yuping Zhang, Zepeng Yang, Bo Ma, Jiahao Wu, Fusheng Jin; The Visual Computer</w:t>
+      </w:r>
+      <w:r>
+        <w:rPr>
+          <w:color w:val="1F4E79"/>
+          <w:sz w:val="18"/>
+        </w:rPr>
+        <w:t xml:space="preserve">  |  https://doi.org/10.1007/s00371-023-03182-5</w:t>
+      </w:r>
+    </w:p>
+    <w:p>
+      <w:r>
+        <w:rPr>
+          <w:color w:val="808080"/>
+          <w:sz w:val="16"/>
+        </w:rPr>
+        <w:t>[abstract source: crossref-title]</w:t>
+      </w:r>
+    </w:p>
+    <w:p>
+      <w:r>
+        <w:t>In visual tracking, the target always undergoes appearance variations due to a variety of challenging situations, such as deformation and rotation. In this paper, we propose the target-guided feature modulation network based on the siamese network to extract more features related to the target. Specifically, we customize two target-guided feature modulation subnetworks for visual tracking, which are called template-guided spatial-attention modulation subnetwork and template-guided channel-attention modulation subnetwork. The former controls the discriminative region based on the correlation of each search feature position with all template feature positions, while the latter readjusts the importance of each channel according to the response value of each channel feature in the template features and in the search features. Extensive experiments on multiple datasets demonstrate the effectiveness of the proposed approach in this paper.</w:t>
+      </w:r>
+    </w:p>
+    <w:p>
+      <w:pPr>
+        <w:pStyle w:val="Heading2"/>
+      </w:pPr>
+      <w:r>
+        <w:t>183. Detection of Anatomical Structures and Lesions in Hand Surgery Through the Use of Artificial Intelligence (2024)</w:t>
+      </w:r>
+    </w:p>
+    <w:p>
+      <w:r>
+        <w:rPr>
+          <w:i/>
+          <w:sz w:val="18"/>
+        </w:rPr>
         <w:t>Guilhem Julia, Anne Fauchon, Rushed Kanawati</w:t>
       </w:r>
       <w:r>
@@ -4756,7 +5516,7 @@
         <w:pStyle w:val="Heading2"/>
       </w:pPr>
       <w:r>
-        <w:t>164. Dynamic Channel Pruning with Adaptive Weight Learning (2022)</w:t>
+        <w:t>184. Dynamic Channel Pruning with Adaptive Weight Learning (2022)</w:t>
       </w:r>
     </w:p>
     <w:p>
@@ -4785,7 +5545,7 @@
         <w:pStyle w:val="Heading2"/>
       </w:pPr>
       <w:r>
-        <w:t>165. Dynamic template updating Siamese network based on status feedback with quality evaluation for visual object tracking (2024)</w:t>
+        <w:t>185. Dynamic template updating Siamese network based on status feedback with quality evaluation for visual object tracking (2024)</w:t>
       </w:r>
     </w:p>
     <w:p>
@@ -4814,7 +5574,7 @@
         <w:pStyle w:val="Heading2"/>
       </w:pPr>
       <w:r>
-        <w:t>166. FAEMTrack: Feature-Augmented Embedding and Cross-Drone Fusion for Single Object Tracking (2025)</w:t>
+        <w:t>186. FAEMTrack: Feature-Augmented Embedding and Cross-Drone Fusion for Single Object Tracking (2025)</w:t>
       </w:r>
     </w:p>
     <w:p>
@@ -4843,7 +5603,7 @@
         <w:pStyle w:val="Heading2"/>
       </w:pPr>
       <w:r>
-        <w:t>167. From passive perception to active control and collaborative planning: A system-level survey on UVA visual moving target tracking (2026)</w:t>
+        <w:t>187. Feature Extraction with Refinement and Rebuilding Module for Visual Tracking (2025)</w:t>
       </w:r>
     </w:p>
     <w:p>
@@ -4852,6 +5612,44 @@
           <w:i/>
           <w:sz w:val="18"/>
         </w:rPr>
+        <w:t>Wenshuang Zhang, Hanhao Li, Pengcheng Sha, Dezheng Zhang, Jun Wang; Signal Image and Video Processing</w:t>
+      </w:r>
+      <w:r>
+        <w:rPr>
+          <w:color w:val="1F4E79"/>
+          <w:sz w:val="18"/>
+        </w:rPr>
+        <w:t xml:space="preserve">  |  https://doi.org/10.1007/s11760-025-04487-9</w:t>
+      </w:r>
+    </w:p>
+    <w:p>
+      <w:r>
+        <w:rPr>
+          <w:color w:val="808080"/>
+          <w:sz w:val="16"/>
+        </w:rPr>
+        <w:t>[abstract source: semanticscholar]</w:t>
+      </w:r>
+    </w:p>
+    <w:p>
+      <w:r>
+        <w:t>Convolutional neural network based trackers have achieved excellent tracking performance in terms of accuracy and speed. The feature extraction network is an essential component of trackers, serving as the foundation for target representation and discrimination. Existing feature extraction sub-networks struggle to adequately extract discriminative target spatial and channel features, which limits their representation capability. Moreover, they fail to effectively suppress background redundancy, leading to potential interference from cluttered environments. To address the limitations of existing tracking methods, we design a novel feature extraction subnetwork that incorporates a refinement and rebuilding module, integrating a Spatial Feature Refinement Module (SFRM) and a Channel Feature Rebuilding Module (CFRM). Different from existing approaches, our approach fully exploits their complementary nature to enhance target representations. The SFRM focuses on refining spatial features to preserve structural and locational accuracy, while the CFRM adaptively rebuilds channel features to strengthen semantic consistency. This design enables more accurate extraction of target features from both the template and search region, effectively highlighting foreground targets while suppressing background. By reducing redundancy in the spatial domain and enhancing feature expressiveness, our method presents a novel and effective tracking framework which achieves more precise target localization. We evaluated the proposed tracker on LaSOT, TrackingNet, NFS, UAV123, GOT-10K, DTB70 and TNL2K benchmarks. Compared to EMAT, our tracker improves by 3.7% in AO.</w:t>
+      </w:r>
+    </w:p>
+    <w:p>
+      <w:pPr>
+        <w:pStyle w:val="Heading2"/>
+      </w:pPr>
+      <w:r>
+        <w:t>188. From passive perception to active control and collaborative planning: A system-level survey on UVA visual moving target tracking (2026)</w:t>
+      </w:r>
+    </w:p>
+    <w:p>
+      <w:r>
+        <w:rPr>
+          <w:i/>
+          <w:sz w:val="18"/>
+        </w:rPr>
         <w:t>Yaodong Wei, Jiageng Liu, Kejuan Xue, Ende Wang; Defence Technology</w:t>
       </w:r>
       <w:r>
@@ -4872,7 +5670,7 @@
         <w:pStyle w:val="Heading2"/>
       </w:pPr>
       <w:r>
-        <w:t>168. Geometrical Relation Prediction Transformer for UAV-Ground Visual Tracking (2026)</w:t>
+        <w:t>189. Geometrical Relation Prediction Transformer for UAV-Ground Visual Tracking (2026)</w:t>
       </w:r>
     </w:p>
     <w:p>
@@ -4901,7 +5699,7 @@
         <w:pStyle w:val="Heading2"/>
       </w:pPr>
       <w:r>
-        <w:t>169. HCETrack: Visual Tracking with Historical Context Information and Feature Enhancement (2025)</w:t>
+        <w:t>190. HCETrack: Visual Tracking with Historical Context Information and Feature Enhancement (2025)</w:t>
       </w:r>
     </w:p>
     <w:p>
@@ -4930,7 +5728,7 @@
         <w:pStyle w:val="Heading2"/>
       </w:pPr>
       <w:r>
-        <w:t>170. HOMA-ST: High-Order Motion-Guided Cross-Attention for UAV Single-Object Tracking (2026)</w:t>
+        <w:t>191. HOMA-ST: High-Order Motion-Guided Cross-Attention for UAV Single-Object Tracking (2026)</w:t>
       </w:r>
     </w:p>
     <w:p>
@@ -4959,7 +5757,7 @@
         <w:pStyle w:val="Heading2"/>
       </w:pPr>
       <w:r>
-        <w:t>171. Hierarchical Supervised Network for Multi-Object Tracking in Reconnaissance UAV Video under Foggy Weather (2025)</w:t>
+        <w:t>192. Hierarchical Supervised Network for Multi-Object Tracking in Reconnaissance UAV Video under Foggy Weather (2025)</w:t>
       </w:r>
     </w:p>
     <w:p>
@@ -4988,7 +5786,7 @@
         <w:pStyle w:val="Heading2"/>
       </w:pPr>
       <w:r>
-        <w:t>172. Integrated channel attention method for Siamese tracker (2024)</w:t>
+        <w:t>193. Integrated channel attention method for Siamese tracker (2024)</w:t>
       </w:r>
     </w:p>
     <w:p>
@@ -5017,7 +5815,7 @@
         <w:pStyle w:val="Heading2"/>
       </w:pPr>
       <w:r>
-        <w:t>173. MHPTrack: Efficient Multimodal Historical Prompting for Aerial Target Tracking (2026)</w:t>
+        <w:t>194. MHPTrack: Efficient Multimodal Historical Prompting for Aerial Target Tracking (2026)</w:t>
       </w:r>
     </w:p>
     <w:p>
@@ -5046,7 +5844,7 @@
         <w:pStyle w:val="Heading2"/>
       </w:pPr>
       <w:r>
-        <w:t>174. MemLoTrack: Enhancing TIR Anti-UAV Tracking with Memory-Integrated Low-Rank Adaptation (2025)</w:t>
+        <w:t>195. MemLoTrack: Enhancing TIR Anti-UAV Tracking with Memory-Integrated Low-Rank Adaptation (2025)</w:t>
       </w:r>
     </w:p>
     <w:p>
@@ -5075,7 +5873,7 @@
         <w:pStyle w:val="Heading2"/>
       </w:pPr>
       <w:r>
-        <w:t>175. Modular Self-Supervised Learning for Hand Surgical Diagnosis (2023)</w:t>
+        <w:t>196. Modular Self-Supervised Learning for Hand Surgical Diagnosis (2023)</w:t>
       </w:r>
     </w:p>
     <w:p>
@@ -5104,7 +5902,7 @@
         <w:pStyle w:val="Heading2"/>
       </w:pPr>
       <w:r>
-        <w:t>176. Multi-Type Target Detection and Tracking in UAV Images under Typical Scenarios (2024)</w:t>
+        <w:t>197. Multi-Type Target Detection and Tracking in UAV Images under Typical Scenarios (2024)</w:t>
       </w:r>
     </w:p>
     <w:p>
@@ -5133,7 +5931,7 @@
         <w:pStyle w:val="Heading2"/>
       </w:pPr>
       <w:r>
-        <w:t>177. Multi-target Tracking with Occlusion Resistance for Mobile Robots in Dynamic Environments* (2024)</w:t>
+        <w:t>198. Multi-target Tracking with Occlusion Resistance for Mobile Robots in Dynamic Environments* (2024)</w:t>
       </w:r>
     </w:p>
     <w:p>
@@ -5162,7 +5960,7 @@
         <w:pStyle w:val="Heading2"/>
       </w:pPr>
       <w:r>
-        <w:t>178. Occlusion-Resistant Visual Tracking for UAVs (2025)</w:t>
+        <w:t>199. Object Tracking with Multiple Dynamic Templates Updating (2023)</w:t>
       </w:r>
     </w:p>
     <w:p>
@@ -5171,6 +5969,44 @@
           <w:i/>
           <w:sz w:val="18"/>
         </w:rPr>
+        <w:t>Mingyang Zhang, Kristof Van Beeck, Toon Goedemé; Lecture notes in computer science</w:t>
+      </w:r>
+      <w:r>
+        <w:rPr>
+          <w:color w:val="1F4E79"/>
+          <w:sz w:val="18"/>
+        </w:rPr>
+        <w:t xml:space="preserve">  |  https://doi.org/10.1007/978-3-031-25825-1_11</w:t>
+      </w:r>
+    </w:p>
+    <w:p>
+      <w:r>
+        <w:rPr>
+          <w:color w:val="808080"/>
+          <w:sz w:val="16"/>
+        </w:rPr>
+        <w:t>[abstract source: openreview]</w:t>
+      </w:r>
+    </w:p>
+    <w:p>
+      <w:r>
+        <w:t>Most existing Siamese visual trackers see the object tracking task as similarity learning between a search image and a single template image. Utilizing only one template leads to the negligence of the rich semantic information in other frames. Meanwhile, those Siamese trackers with temporal context exploitation either incorporate specially designed non-generic modules or include online-learning parts which compromise real-time performance. In this paper, we propose a novel model architecture incorporating multiple dynamic templates in a Siamese visual tracker to maximize temporal information utilization. To attain a favorable appearance representation from these templates, we propose an online dynamic template pool updater that leverages the frames with dissimilar appearances. Furthermore, we design a new hard positive sampling strategy to train the tracker with dissimilar templates. With the proposed methods, a Siamese tracker can be straightforwardly transformed and trained to benefit from the temporal correlations among frames. Comprehensive experiments on various tracking datasets show positive results and prove the effectiveness of the proposed methods.</w:t>
+      </w:r>
+    </w:p>
+    <w:p>
+      <w:pPr>
+        <w:pStyle w:val="Heading2"/>
+      </w:pPr>
+      <w:r>
+        <w:t>200. Occlusion-Resistant Visual Tracking for UAVs (2025)</w:t>
+      </w:r>
+    </w:p>
+    <w:p>
+      <w:r>
+        <w:rPr>
+          <w:i/>
+          <w:sz w:val="18"/>
+        </w:rPr>
         <w:t>Qiyuan Bai, Zhezhuang Xu, Yuanheng Wang, Yuhang Zhu; IEEE International Conference on Unmanned Systems (ICUS)</w:t>
       </w:r>
       <w:r>
@@ -5191,7 +6027,7 @@
         <w:pStyle w:val="Heading2"/>
       </w:pPr>
       <w:r>
-        <w:t>179. Parallel Perceptual Attention and Multifrequency Matching Network for UAV Tracking (2025)</w:t>
+        <w:t>201. PEBTrack: A Performance-Efficiency Balance Tracker for Aerial Scenario (2025)</w:t>
       </w:r>
     </w:p>
     <w:p>
@@ -5200,6 +6036,44 @@
           <w:i/>
           <w:sz w:val="18"/>
         </w:rPr>
+        <w:t>Xuesen Ma, Xiulan Yu, Xinghao Peng; Lecture notes in computer science</w:t>
+      </w:r>
+      <w:r>
+        <w:rPr>
+          <w:color w:val="1F4E79"/>
+          <w:sz w:val="18"/>
+        </w:rPr>
+        <w:t xml:space="preserve">  |  https://doi.org/10.1007/978-981-96-6596-9_14</w:t>
+      </w:r>
+    </w:p>
+    <w:p>
+      <w:r>
+        <w:rPr>
+          <w:color w:val="808080"/>
+          <w:sz w:val="16"/>
+        </w:rPr>
+        <w:t>[abstract source: openreview]</w:t>
+      </w:r>
+    </w:p>
+    <w:p>
+      <w:r>
+        <w:t>In recent years, Siamese-based object tracking methods have gained significant attention in the UAV field. However, the computational limitations of UAV platforms and the specific challenges of aerial tracking make it difficult for existing methods to achieve both real-time performance and high accuracy. This paper proposes PEBTrack, a tracker designed to balance performance and efficiency for UAV scenarios. PEBTrack uses MobileNetV3, a lightweight network optimized for mobile devices, to reduce model parameters and increase inference speed. Additionally, two attention modules are introduced: the Channel Shift Attention Module and the Context Local Perception Attention Module. These modules enhance the robustness of the algorithm by extracting detailed visual information and improving the network’s ability to capture local features. Additionally, a network for feature fusion is utilized to combine various types of semantic information, enhancing the flow of information. The regression and classification operations are decoupled to refine the tracked object and improve tracking accuracy. Experimental findings illustrate the effectiveness of PEBTrack, which achieves a processing speed of 45 FPS using CPU inference. It outperforms existing algorithms on the UAV123 and DTB70 benchmarks, showing accuracy and robustness comparable to TCTrack, a state-of-the-art tracker.</w:t>
+      </w:r>
+    </w:p>
+    <w:p>
+      <w:pPr>
+        <w:pStyle w:val="Heading2"/>
+      </w:pPr>
+      <w:r>
+        <w:t>202. Parallel Perceptual Attention and Multifrequency Matching Network for UAV Tracking (2025)</w:t>
+      </w:r>
+    </w:p>
+    <w:p>
+      <w:r>
+        <w:rPr>
+          <w:i/>
+          <w:sz w:val="18"/>
+        </w:rPr>
         <w:t>Anping Deng, Guangliang Han, Hang Yang, Zhichao Liu, Jianping Li, Dianbing Chen; IEEE Geoscience and Remote Sensing Letters</w:t>
       </w:r>
       <w:r>
@@ -5220,7 +6094,7 @@
         <w:pStyle w:val="Heading2"/>
       </w:pPr>
       <w:r>
-        <w:t>180. Progressive Hierarchical Feature Periodic Transformer for Robust UAV Tracking (2025)</w:t>
+        <w:t>203. Progressive Hierarchical Feature Periodic Transformer for Robust UAV Tracking (2025)</w:t>
       </w:r>
     </w:p>
     <w:p>
@@ -5249,7 +6123,7 @@
         <w:pStyle w:val="Heading2"/>
       </w:pPr>
       <w:r>
-        <w:t>181. RSconv: A Shape-Adaptive Learnable Affine Convolution Mode for Robust UAV Tracking in Infrared Scene (2026)</w:t>
+        <w:t>204. RSconv: A Shape-Adaptive Learnable Affine Convolution Mode for Robust UAV Tracking in Infrared Scene (2026)</w:t>
       </w:r>
     </w:p>
     <w:p>
@@ -5278,7 +6152,7 @@
         <w:pStyle w:val="Heading2"/>
       </w:pPr>
       <w:r>
-        <w:t>182. Real-Time UAV Tracking Through Disentangled Representation With Mutual Information Maximization (2024)</w:t>
+        <w:t>205. Real-Time UAV Tracking Through Disentangled Representation With Mutual Information Maximization (2024)</w:t>
       </w:r>
     </w:p>
     <w:p>
@@ -5307,7 +6181,7 @@
         <w:pStyle w:val="Heading2"/>
       </w:pPr>
       <w:r>
-        <w:t>183. SiamDC: Efficient UAV Visual Tracking via Collaborative Dual-Channel Enhancement and Cascaded Cross-Correlation Fusion (2026)</w:t>
+        <w:t>206. SiamDC: Efficient UAV Visual Tracking via Collaborative Dual-Channel Enhancement and Cascaded Cross-Correlation Fusion (2026)</w:t>
       </w:r>
     </w:p>
     <w:p>
@@ -5336,7 +6210,7 @@
         <w:pStyle w:val="Heading2"/>
       </w:pPr>
       <w:r>
-        <w:t>184. SiamSCT: Spatial-Channel Saliency and Temporal Fusion Network for Real-Time Aerial Tracking (2025)</w:t>
+        <w:t>207. SiamSCT: Spatial-Channel Saliency and Temporal Fusion Network for Real-Time Aerial Tracking (2025)</w:t>
       </w:r>
     </w:p>
     <w:p>
@@ -5365,7 +6239,7 @@
         <w:pStyle w:val="Heading2"/>
       </w:pPr>
       <w:r>
-        <w:t>185. Sparse Transformer Refinement Similarity Map for Aerial Tracking (2024)</w:t>
+        <w:t>208. Sparse Transformer Refinement Similarity Map for Aerial Tracking (2024)</w:t>
       </w:r>
     </w:p>
     <w:p>
@@ -5394,7 +6268,7 @@
         <w:pStyle w:val="Heading2"/>
       </w:pPr>
       <w:r>
-        <w:t>186. Synergistic Frequency-Spatial Enhancement With Temporal Correlation for Robust Satellite Video Tracking (2026)</w:t>
+        <w:t>209. Synergistic Frequency-Spatial Enhancement With Temporal Correlation for Robust Satellite Video Tracking (2026)</w:t>
       </w:r>
     </w:p>
     <w:p>
@@ -5423,7 +6297,7 @@
         <w:pStyle w:val="Heading2"/>
       </w:pPr>
       <w:r>
-        <w:t>187. Temporal Context Attention-Based Tracker for UAV Tracking (2023)</w:t>
+        <w:t>210. Temporal Context Attention-Based Tracker for UAV Tracking (2023)</w:t>
       </w:r>
     </w:p>
     <w:p>
@@ -5452,7 +6326,7 @@
         <w:pStyle w:val="Heading2"/>
       </w:pPr>
       <w:r>
-        <w:t>188. Temporal Information and Feature Fusion for RGBT Tracking (2026)</w:t>
+        <w:t>211. Temporal Information and Feature Fusion for RGBT Tracking (2026)</w:t>
       </w:r>
     </w:p>
     <w:p>
@@ -5481,7 +6355,7 @@
         <w:pStyle w:val="Heading2"/>
       </w:pPr>
       <w:r>
-        <w:t>189. The UAV Single Target Tracking Algorithm Based on Multimodal Data (2025)</w:t>
+        <w:t>212. The UAV Single Target Tracking Algorithm Based on Multimodal Data (2025)</w:t>
       </w:r>
     </w:p>
     <w:p>
@@ -5510,7 +6384,7 @@
         <w:pStyle w:val="Heading2"/>
       </w:pPr>
       <w:r>
-        <w:t>190. Tracker-LLM: Enhancing Visual Object Tracking via Bi-directional Chain-of-Thought Reasoning and Spatio-Temporal Memory (2026)</w:t>
+        <w:t>213. Tracker-LLM: Enhancing Visual Object Tracking via Bi-directional Chain-of-Thought Reasoning and Spatio-Temporal Memory (2026)</w:t>
       </w:r>
     </w:p>
     <w:p>
@@ -5539,7 +6413,7 @@
         <w:pStyle w:val="Heading2"/>
       </w:pPr>
       <w:r>
-        <w:t>191. UAV Detection in Challenging Scenarios Based on Adaptive Frame-Weighting and Edge-Locating (2026)</w:t>
+        <w:t>214. UAV Detection in Challenging Scenarios Based on Adaptive Frame-Weighting and Edge-Locating (2026)</w:t>
       </w:r>
     </w:p>
     <w:p>
@@ -5568,7 +6442,7 @@
         <w:pStyle w:val="Heading2"/>
       </w:pPr>
       <w:r>
-        <w:t>192. Unified Multi-Modal Object Tracking Through Spatial–Temporal Propagation and Modality Synergy (2025)</w:t>
+        <w:t>215. UAV-Based Maritime Object Tracking: A New Data Set and Dynamic Multi-scale Fusion Transformer (2026)</w:t>
       </w:r>
     </w:p>
     <w:p>
@@ -5577,6 +6451,44 @@
           <w:i/>
           <w:sz w:val="18"/>
         </w:rPr>
+        <w:t>Xinyue Wang, Jingjing Xiao, Xinghui Dong; SSRN Electronic Journal</w:t>
+      </w:r>
+      <w:r>
+        <w:rPr>
+          <w:color w:val="1F4E79"/>
+          <w:sz w:val="18"/>
+        </w:rPr>
+        <w:t xml:space="preserve">  |  https://doi.org/10.2139/ssrn.7345297</w:t>
+      </w:r>
+    </w:p>
+    <w:p>
+      <w:r>
+        <w:rPr>
+          <w:color w:val="808080"/>
+          <w:sz w:val="16"/>
+        </w:rPr>
+        <w:t>[abstract source: crossref-doi]</w:t>
+      </w:r>
+    </w:p>
+    <w:p>
+      <w:r>
+        <w:t>To perform the Unmanned Aerial Vehicle-based (UAV-based) maritime object tracking task, we acquire a new ship tracking data set, namely, UAVSeaShip102. This task faces severe challenges due to rapid target motion, drastic scale variations, and frequent occlusion in complex aerial scenes. Recent transformer-based trackers have shown remarkable potential in modeling long-range dependencies. However, their performance often deteriorates when faced with large-scale changes or unreliable updates. To address these issues, we propose a Dynamic Multi-scale Fusion Transformer Tracker (DMFTrack) for UAV-based single object tracking, which comprises two key components, i.e., a Dynamically-Weighted Multi-scale Feature Fusion Module (DWMS-FFM) and an Adaptive Template Update Mechanism (ATUM). The DWMS-FFM adaptively aggregates features from multiple scales via a learnable gating strategy, allowing the model to dynamically balance spatial details and global context. Furthermore, the ATUM employs a Score Head to estimate the reliability of the current template through dual-stage cross-attention, allowing confidence-guided online template updates that mitigate model drift. Extensive experiments conducted on UAVSeaShip102 and five commonly-used UAV-based benchmarks demonstrate that our method outperforms 22 trackers in challenging scenarios, which involve scale variation, occlusion, and background clutter, while maintaining real-time performance. It is suggested that DMFTrack is also applicable to other aerial tracking scenarios.</w:t>
+      </w:r>
+    </w:p>
+    <w:p>
+      <w:pPr>
+        <w:pStyle w:val="Heading2"/>
+      </w:pPr>
+      <w:r>
+        <w:t>216. Unified Multi-Modal Object Tracking Through Spatial–Temporal Propagation and Modality Synergy (2025)</w:t>
+      </w:r>
+    </w:p>
+    <w:p>
+      <w:r>
+        <w:rPr>
+          <w:i/>
+          <w:sz w:val="18"/>
+        </w:rPr>
         <w:t>Jiajia Wu, Haorui Zuo, Yuxing Wei, Meihui Li, Jianlin Zhang; Journal of Imaging</w:t>
       </w:r>
       <w:r>
@@ -5602,7 +6514,7 @@
     </w:p>
     <w:p>
       <w:r>
-        <w:t>These works cite TCTrack but no abstract text was available from open indexes (paywalled venues, workshop records, theses, or preprints without indexed abstracts):</w:t>
+        <w:t>These works cite TCTrack but no abstract text was available from any open source (OpenAlex, CrossRef, Semantic Scholar, OpenReview) — paywalled publisher pages or non-indexed venues:</w:t>
       </w:r>
     </w:p>
     <w:p>
@@ -5610,7 +6522,7 @@
         <w:pStyle w:val="ListBullet"/>
       </w:pPr>
       <w:r>
-        <w:t>Siamese object tracking for unmanned aerial vehicle: a review and comprehensive analysis (2023) — Artificial Intelligence Review — https://doi.org/10.1007/s10462-023-10558-5</w:t>
+        <w:t>Adaptive temporal feature modeling for visual tracking via cross-channel learning (2023) — Knowledge-Based Systems — https://doi.org/10.1016/j.knosys.2023.110380</w:t>
       </w:r>
     </w:p>
     <w:p>
@@ -5618,7 +6530,7 @@
         <w:pStyle w:val="ListBullet"/>
       </w:pPr>
       <w:r>
-        <w:t>Adaptive temporal feature modeling for visual tracking via cross-channel learning (2023) — Knowledge-Based Systems — https://doi.org/10.1016/j.knosys.2023.110380</w:t>
+        <w:t>Learning Dual-Fused Modality-Aware Representations for RGBD Tracking (2023) — Lecture notes in computer science — https://doi.org/10.1007/978-3-031-25085-9_27</w:t>
       </w:r>
     </w:p>
     <w:p>
@@ -5626,7 +6538,7 @@
         <w:pStyle w:val="ListBullet"/>
       </w:pPr>
       <w:r>
-        <w:t>Learning Dual-Fused Modality-Aware Representations for RGBD Tracking (2023) — Lecture notes in computer science — https://doi.org/10.1007/978-3-031-25085-9_27</w:t>
+        <w:t>Uncertainty and diversity-based active learning for UAV tracking (2025) — Neurocomputing — https://doi.org/10.1016/j.neucom.2025.130265</w:t>
       </w:r>
     </w:p>
     <w:p>
@@ -5634,7 +6546,7 @@
         <w:pStyle w:val="ListBullet"/>
       </w:pPr>
       <w:r>
-        <w:t>Uncertainty and diversity-based active learning for UAV tracking (2025) — Neurocomputing — https://doi.org/10.1016/j.neucom.2025.130265</w:t>
+        <w:t>PPTtrack: Pyramid pooling based Transformer backbone for visual tracking (2024) — Expert Systems with Applications — https://doi.org/10.1016/j.eswa.2024.123716</w:t>
       </w:r>
     </w:p>
     <w:p>
@@ -5642,7 +6554,7 @@
         <w:pStyle w:val="ListBullet"/>
       </w:pPr>
       <w:r>
-        <w:t>BioDrone: A Bionic Drone-Based Single Object Tracking Benchmark for Robust Vision (2023) — International Journal of Computer Vision — https://doi.org/10.1007/s11263-023-01937-0</w:t>
+        <w:t>A robust spatial-temporal correlation filter tracker for efficient UAV visual tracking (2022) — Applied Intelligence — https://doi.org/10.1007/s10489-022-03727-6</w:t>
       </w:r>
     </w:p>
     <w:p>
@@ -5650,7 +6562,7 @@
         <w:pStyle w:val="ListBullet"/>
       </w:pPr>
       <w:r>
-        <w:t>Exploring reliable infrared object tracking with spatio-temporal fusion transformer (2023) — Knowledge-Based Systems — https://doi.org/10.1016/j.knosys.2023.111234</w:t>
+        <w:t>Transformer-based moving target tracking method for Unmanned Aerial Vehicle (2022) — Engineering Applications of Artificial Intelligence — https://doi.org/10.1016/j.engappai.2022.105483</w:t>
       </w:r>
     </w:p>
     <w:p>
@@ -5658,7 +6570,7 @@
         <w:pStyle w:val="ListBullet"/>
       </w:pPr>
       <w:r>
-        <w:t>PPTtrack: Pyramid pooling based Transformer backbone for visual tracking (2024) — Expert Systems with Applications — https://doi.org/10.1016/j.eswa.2024.123716</w:t>
+        <w:t>Dynamic region-aware transformer backbone network for visual tracking (2024) — Engineering Applications of Artificial Intelligence — https://doi.org/10.1016/j.engappai.2024.108329</w:t>
       </w:r>
     </w:p>
     <w:p>
@@ -5666,7 +6578,7 @@
         <w:pStyle w:val="ListBullet"/>
       </w:pPr>
       <w:r>
-        <w:t>A robust spatial-temporal correlation filter tracker for efficient UAV visual tracking (2022) — Applied Intelligence — https://doi.org/10.1007/s10489-022-03727-6</w:t>
+        <w:t>Visual object tracking: Review and challenges (2025) — Applied Soft Computing — https://doi.org/10.1016/j.asoc.2025.113140</w:t>
       </w:r>
     </w:p>
     <w:p>
@@ -5674,7 +6586,7 @@
         <w:pStyle w:val="ListBullet"/>
       </w:pPr>
       <w:r>
-        <w:t>Transformer-based moving target tracking method for Unmanned Aerial Vehicle (2022) — Engineering Applications of Artificial Intelligence — https://doi.org/10.1016/j.engappai.2022.105483</w:t>
+        <w:t>Joint target and background temporal propagation for aerial tracking (2024) — ISPRS Journal of Photogrammetry and Remote Sensing — https://doi.org/10.1016/j.isprsjprs.2024.03.022</w:t>
       </w:r>
     </w:p>
     <w:p>
@@ -5682,7 +6594,7 @@
         <w:pStyle w:val="ListBullet"/>
       </w:pPr>
       <w:r>
-        <w:t>Dynamic region-aware transformer backbone network for visual tracking (2024) — Engineering Applications of Artificial Intelligence — https://doi.org/10.1016/j.engappai.2024.108329</w:t>
+        <w:t>Facing challenges: A survey of object tracking (2025) — Digital Signal Processing — https://doi.org/10.1016/j.dsp.2025.105082</w:t>
       </w:r>
     </w:p>
     <w:p>
@@ -5690,7 +6602,7 @@
         <w:pStyle w:val="ListBullet"/>
       </w:pPr>
       <w:r>
-        <w:t>Temporal adaptive bidirectional bridging for RGB-D tracking (2024) — Pattern Recognition — https://doi.org/10.1016/j.patcog.2024.111053</w:t>
+        <w:t>Improving Surveillance Object Detection with Adaptive Omni-Attention over Both Inter-frame and Intra-frame Context (2023) — Lecture notes in computer science — https://doi.org/10.1007/978-3-031-26284-5_14</w:t>
       </w:r>
     </w:p>
     <w:p>
@@ -5698,7 +6610,7 @@
         <w:pStyle w:val="ListBullet"/>
       </w:pPr>
       <w:r>
-        <w:t>Visual object tracking: Review and challenges (2025) — Applied Soft Computing — https://doi.org/10.1016/j.asoc.2025.113140</w:t>
+        <w:t>Adaptive information flow propagation for visual tracking (2025) — Knowledge-Based Systems — https://doi.org/10.1016/j.knosys.2025.113828</w:t>
       </w:r>
     </w:p>
     <w:p>
@@ -5706,7 +6618,7 @@
         <w:pStyle w:val="ListBullet"/>
       </w:pPr>
       <w:r>
-        <w:t>Towards universal and sparse adversarial examples for visual object tracking (2024) — Applied Soft Computing — https://doi.org/10.1016/j.asoc.2024.111252</w:t>
+        <w:t>Fast visual tracking with lightweight Siamese network and template-guided learning (2022) — Knowledge-Based Systems — https://doi.org/10.1016/j.knosys.2022.110037</w:t>
       </w:r>
     </w:p>
     <w:p>
@@ -5714,7 +6626,7 @@
         <w:pStyle w:val="ListBullet"/>
       </w:pPr>
       <w:r>
-        <w:t>APPTracker+: Displacement Uncertainty for Occlusion Handling in Low-Frame-Rate Multiple Object Tracking (2024) — International Journal of Computer Vision — https://doi.org/10.1007/s11263-024-02237-x</w:t>
+        <w:t>STIFormer: RGB-T tracking via Spatial–Temporal Interaction Transformer (2026) — Image and Vision Computing — https://doi.org/10.1016/j.imavis.2026.105929</w:t>
       </w:r>
     </w:p>
     <w:p>
@@ -5722,7 +6634,7 @@
         <w:pStyle w:val="ListBullet"/>
       </w:pPr>
       <w:r>
-        <w:t>Learning Feature Restoration Transformer for Robust Dehazing Visual Object Tracking (2024) — International Journal of Computer Vision — https://doi.org/10.1007/s11263-024-02182-9</w:t>
+        <w:t>Dual knowledge distillation for visual tracking with teacher–student network (2024) — Signal Image and Video Processing — https://doi.org/10.1007/s11760-024-03226-w</w:t>
       </w:r>
     </w:p>
     <w:p>
@@ -5730,7 +6642,7 @@
         <w:pStyle w:val="ListBullet"/>
       </w:pPr>
       <w:r>
-        <w:t>Spatio-temporal mix deformable feature extractor in visual tracking (2023) — Expert Systems with Applications — https://doi.org/10.1016/j.eswa.2023.121377</w:t>
+        <w:t>Incorporating prior knowledge and temporal memory transformer network for satellite video object tracking (2025) — ISPRS Journal of Photogrammetry and Remote Sensing — https://doi.org/10.1016/j.isprsjprs.2025.07.032</w:t>
       </w:r>
     </w:p>
     <w:p>
@@ -5738,7 +6650,7 @@
         <w:pStyle w:val="ListBullet"/>
       </w:pPr>
       <w:r>
-        <w:t>Joint target and background temporal propagation for aerial tracking (2024) — ISPRS Journal of Photogrammetry and Remote Sensing — https://doi.org/10.1016/j.isprsjprs.2024.03.022</w:t>
+        <w:t>TVAE-3D: Efficient multi-view 3D shape reconstruction with diffusion models and transformer based VAE (2025) — Cluster Computing — https://doi.org/10.1007/s10586-025-05618-0</w:t>
       </w:r>
     </w:p>
     <w:p>
@@ -5746,7 +6658,7 @@
         <w:pStyle w:val="ListBullet"/>
       </w:pPr>
       <w:r>
-        <w:t>Facing challenges: A survey of object tracking (2025) — Digital Signal Processing — https://doi.org/10.1016/j.dsp.2025.105082</w:t>
+        <w:t>CASS: A Context-Aware Memory Framework With Spectral–Spatial Modulation for UAV Multispectral Video Tracking (2026) — IEEE Transactions on Circuits and Systems for Video Technology — https://doi.org/10.1109/tcsvt.2026.3708187</w:t>
       </w:r>
     </w:p>
     <w:p>
@@ -5754,7 +6666,7 @@
         <w:pStyle w:val="ListBullet"/>
       </w:pPr>
       <w:r>
-        <w:t>Jointly modeling association and motion cues for robust infrared UAV tracking (2024) — The Visual Computer — https://doi.org/10.1007/s00371-023-03245-7</w:t>
+        <w:t>End-to-end wavelet block feature purification network for efficient and effective UAV object tracking (2023) — Journal of Visual Communication and Image Representation — https://doi.org/10.1016/j.jvcir.2023.103950</w:t>
       </w:r>
     </w:p>
     <w:p>
@@ -5762,7 +6674,7 @@
         <w:pStyle w:val="ListBullet"/>
       </w:pPr>
       <w:r>
-        <w:t>Saliency information and mosaic based data augmentation method for densely occluded object recognition (2024) — Pattern Analysis and Applications — https://doi.org/10.1007/s10044-024-01258-z</w:t>
+        <w:t>Structural-appearance information fusion for visual tracking (2023) — The Visual Computer — https://doi.org/10.1007/s00371-023-03013-7</w:t>
       </w:r>
     </w:p>
     <w:p>
@@ -5770,7 +6682,7 @@
         <w:pStyle w:val="ListBullet"/>
       </w:pPr>
       <w:r>
-        <w:t>Improving Surveillance Object Detection with Adaptive Omni-Attention over Both Inter-frame and Intra-frame Context (2023) — Lecture notes in computer science — https://doi.org/10.1007/978-3-031-26284-5_14</w:t>
+        <w:t>Unified Spatio-Temporal Tracking via Adaptive Embedding and Temporal Context Modeling (2026) — Knowledge-Based Systems — https://doi.org/10.1016/j.knosys.2026.116116</w:t>
       </w:r>
     </w:p>
     <w:p>
@@ -5778,7 +6690,7 @@
         <w:pStyle w:val="ListBullet"/>
       </w:pPr>
       <w:r>
-        <w:t>ATFTrans: attention-weighted token fusion transformer for robust and efficient object tracking (2024) — Neural Computing and Applications — https://doi.org/10.1007/s00521-024-09444-0</w:t>
+        <w:t>BTMTrack: Robust RGB-T tracking via dual-template bridging and temporal-modal candidate elimination (2025) — Image and Vision Computing — https://doi.org/10.1016/j.imavis.2025.105676</w:t>
       </w:r>
     </w:p>
     <w:p>
@@ -5786,7 +6698,7 @@
         <w:pStyle w:val="ListBullet"/>
       </w:pPr>
       <w:r>
-        <w:t>Unmanned Aerial Vehicle-based Autonomous Tracking System for Invasive Flying Insects (2024) — Computers and Electronics in Agriculture — https://doi.org/10.1016/j.compag.2024.109616</w:t>
+        <w:t>CAT: A Unified Click-and-Track Framework for Realistic Tracking (2025) — IEEE/CVF International Conference on Computer Vision (ICCV) — https://doi.org/10.1109/iccv51701.2025.00539</w:t>
       </w:r>
     </w:p>
     <w:p>
@@ -5794,7 +6706,7 @@
         <w:pStyle w:val="ListBullet"/>
       </w:pPr>
       <w:r>
-        <w:t>Adaptive information flow propagation for visual tracking (2025) — Knowledge-Based Systems — https://doi.org/10.1016/j.knosys.2025.113828</w:t>
+        <w:t>HFS: an intelligent heuristic feature selection scheme to correct uncertainty (2024) — The Journal of Supercomputing — https://doi.org/10.1007/s11227-024-06437-7</w:t>
       </w:r>
     </w:p>
     <w:p>
@@ -5802,7 +6714,7 @@
         <w:pStyle w:val="ListBullet"/>
       </w:pPr>
       <w:r>
-        <w:t>Enhancing UAV tracking: a focus on discriminative representations using contrastive instances (2024) — Journal of Real-Time Image Processing — https://doi.org/10.1007/s11554-024-01456-2</w:t>
+        <w:t>Siam2C: Siamese visual segmentation and tracking with classification-rank loss and classification-aware (2024) — Applied Intelligence — https://doi.org/10.1007/s10489-024-05840-0</w:t>
       </w:r>
     </w:p>
     <w:p>
@@ -5810,7 +6722,7 @@
         <w:pStyle w:val="ListBullet"/>
       </w:pPr>
       <w:r>
-        <w:t>Fast visual tracking with lightweight Siamese network and template-guided learning (2022) — Knowledge-Based Systems — https://doi.org/10.1016/j.knosys.2022.110037</w:t>
+        <w:t>Siamsdt: a self-adaptive dynamic template siamese network for airborne visual tracking of MAVs on heterogeneous FPGA-SoC (2025) — The Journal of Supercomputing — https://doi.org/10.1007/s11227-025-06928-1</w:t>
       </w:r>
     </w:p>
     <w:p>
@@ -5818,7 +6730,7 @@
         <w:pStyle w:val="ListBullet"/>
       </w:pPr>
       <w:r>
-        <w:t>STIFormer: RGB-T tracking via Spatial–Temporal Interaction Transformer (2026) — Image and Vision Computing — https://doi.org/10.1016/j.imavis.2026.105929</w:t>
+        <w:t>Memory optimization network for enhanced vision-language target tracking (2026) — The Journal of Supercomputing — https://doi.org/10.1007/s11227-026-08377-w</w:t>
       </w:r>
     </w:p>
     <w:p>
@@ -5826,7 +6738,7 @@
         <w:pStyle w:val="ListBullet"/>
       </w:pPr>
       <w:r>
-        <w:t>Dual knowledge distillation for visual tracking with teacher–student network (2024) — Signal Image and Video Processing — https://doi.org/10.1007/s11760-024-03226-w</w:t>
+        <w:t>Propagating prior information with transformer for robust visual object tracking (2024) — Multimedia Systems — https://doi.org/10.1007/s00530-024-01423-8</w:t>
       </w:r>
     </w:p>
     <w:p>
@@ -5834,7 +6746,7 @@
         <w:pStyle w:val="ListBullet"/>
       </w:pPr>
       <w:r>
-        <w:t>Incorporating prior knowledge and temporal memory transformer network for satellite video object tracking (2025) — ISPRS Journal of Photogrammetry and Remote Sensing — https://doi.org/10.1016/j.isprsjprs.2025.07.032</w:t>
+        <w:t>SiamAUDT: adaptive updating decision for online Siamese tracker (2024) — Multimedia Tools and Applications — https://doi.org/10.1007/s11042-024-18587-0</w:t>
       </w:r>
     </w:p>
     <w:p>
@@ -5842,7 +6754,7 @@
         <w:pStyle w:val="ListBullet"/>
       </w:pPr>
       <w:r>
-        <w:t>Object tracking based on siamese network with 3D attention and multiple graph attention (2023) — Computer Vision and Image Understanding — https://doi.org/10.1016/j.cviu.2023.103786</w:t>
+        <w:t>TAPTrack: An Efficient Temporal-Aware Prompt Tracker for Infrared Anti-UAV Tracking (2026) — IEEE Transactions on Geoscience and Remote Sensing — https://doi.org/10.1109/tgrs.2026.3682081</w:t>
       </w:r>
     </w:p>
     <w:p>
@@ -5850,7 +6762,7 @@
         <w:pStyle w:val="ListBullet"/>
       </w:pPr>
       <w:r>
-        <w:t>TVAE-3D: Efficient multi-view 3D shape reconstruction with diffusion models and transformer based VAE (2025) — Cluster Computing — https://doi.org/10.1007/s10586-025-05618-0</w:t>
+        <w:t>Target-aware pooling combining global contexts for aerial tracking (2024) — The Visual Computer — https://doi.org/10.1007/s00371-024-03282-w</w:t>
       </w:r>
     </w:p>
     <w:p>
@@ -5858,7 +6770,7 @@
         <w:pStyle w:val="ListBullet"/>
       </w:pPr>
       <w:r>
-        <w:t>CASS: A Context-Aware Memory Framework With Spectral–Spatial Modulation for UAV Multispectral Video Tracking (2026) — IEEE Transactions on Circuits and Systems for Video Technology — https://doi.org/10.1109/tcsvt.2026.3708187</w:t>
+        <w:t>A novel lightweight Siamese-like tracker based on transformers with unidirectional mixed attention (2026) — Pattern Analysis and Applications — https://doi.org/10.1007/s10044-026-01771-3</w:t>
       </w:r>
     </w:p>
     <w:p>
@@ -5866,7 +6778,7 @@
         <w:pStyle w:val="ListBullet"/>
       </w:pPr>
       <w:r>
-        <w:t>End-to-end wavelet block feature purification network for efficient and effective UAV object tracking (2023) — Journal of Visual Communication and Image Representation — https://doi.org/10.1016/j.jvcir.2023.103950</w:t>
+        <w:t>AMV-tracker: an adaptive multi-view complementary information tracking algorithm with a dynamic activation mechanism (2026) — Displays — https://doi.org/10.1016/j.displa.2026.103545</w:t>
       </w:r>
     </w:p>
     <w:p>
@@ -5874,7 +6786,7 @@
         <w:pStyle w:val="ListBullet"/>
       </w:pPr>
       <w:r>
-        <w:t>Structural-appearance information fusion for visual tracking (2023) — The Visual Computer — https://doi.org/10.1007/s00371-023-03013-7</w:t>
+        <w:t>Blur-guided motion and spatio-temporal swarm graph modeling for UAV intent understanding (2026) — Knowledge-Based Systems — https://doi.org/10.1016/j.knosys.2026.116895</w:t>
       </w:r>
     </w:p>
     <w:p>
@@ -5882,7 +6794,7 @@
         <w:pStyle w:val="ListBullet"/>
       </w:pPr>
       <w:r>
-        <w:t>Unified Spatio-Temporal Tracking via Adaptive Embedding and Temporal Context Modeling (2026) — Knowledge-Based Systems — https://doi.org/10.1016/j.knosys.2026.116116</w:t>
+        <w:t>DFCTrack: dynamic full-temporal context fusion for object tracking (2026) — International Journal of Machine Learning and Cybernetics — https://doi.org/10.1007/s13042-026-03261-8</w:t>
       </w:r>
     </w:p>
     <w:p>
@@ -5890,7 +6802,7 @@
         <w:pStyle w:val="ListBullet"/>
       </w:pPr>
       <w:r>
-        <w:t>BTMTrack: Robust RGB-T tracking via dual-template bridging and temporal-modal candidate elimination (2025) — Image and Vision Computing — https://doi.org/10.1016/j.imavis.2025.105676</w:t>
+        <w:t>DynaTrack-Air: Dynamic Template Fusion with Retrospective Consistency Verification for Robust UAV Tracking (2025) — China Automation Congress (CAC) — https://doi.org/10.1109/cac67268.2025.11487800</w:t>
       </w:r>
     </w:p>
     <w:p>
@@ -5898,7 +6810,7 @@
         <w:pStyle w:val="ListBullet"/>
       </w:pPr>
       <w:r>
-        <w:t>CAT: A Unified Click-and-Track Framework for Realistic Tracking (2025) — IEEE/CVF International Conference on Computer Vision (ICCV) — https://doi.org/10.1109/iccv51701.2025.00539</w:t>
+        <w:t>Efficient UAV Object Tracking via Visual Contrastive Attention and Hybrid Adaptive Computation (2026) — https://doi.org/10.1109/ust70584.2026.11663823</w:t>
       </w:r>
     </w:p>
     <w:p>
@@ -5906,7 +6818,7 @@
         <w:pStyle w:val="ListBullet"/>
       </w:pPr>
       <w:r>
-        <w:t>COST: Contrastive one-stage transformer for vision-language small object tracking (2025) — Information Fusion — https://doi.org/10.1016/j.inffus.2025.103604</w:t>
+        <w:t>Gradually target activating and self-supervised enhancing for visual tracking (2026) — Knowledge-Based Systems — https://doi.org/10.1016/j.knosys.2026.116779</w:t>
       </w:r>
     </w:p>
     <w:p>
@@ -5914,7 +6826,7 @@
         <w:pStyle w:val="ListBullet"/>
       </w:pPr>
       <w:r>
-        <w:t>HFS: an intelligent heuristic feature selection scheme to correct uncertainty (2024) — The Journal of Supercomputing — https://doi.org/10.1007/s11227-024-06437-7</w:t>
+        <w:t>HEATTrack: History Evidence Injection and Target-Aware Prompting for Aerial Multispectral Single-Object Tracking (2026) — IEEE Transactions on Geoscience and Remote Sensing — https://doi.org/10.1109/tgrs.2026.3709525</w:t>
       </w:r>
     </w:p>
     <w:p>
@@ -5922,7 +6834,7 @@
         <w:pStyle w:val="ListBullet"/>
       </w:pPr>
       <w:r>
-        <w:t>Siam2C: Siamese visual segmentation and tracking with classification-rank loss and classification-aware (2024) — Applied Intelligence — https://doi.org/10.1007/s10489-024-05840-0</w:t>
+        <w:t>Learning Shallow-Robust Vision Transformers With Selective Distillation for Real-Time UAV Tracking (2026) — IEEE Transactions on Circuits and Systems for Video Technology — https://doi.org/10.1109/tcsvt.2026.3706810</w:t>
       </w:r>
     </w:p>
     <w:p>
@@ -5930,7 +6842,7 @@
         <w:pStyle w:val="ListBullet"/>
       </w:pPr>
       <w:r>
-        <w:t>Siamsdt: a self-adaptive dynamic template siamese network for airborne visual tracking of MAVs on heterogeneous FPGA-SoC (2025) — The Journal of Supercomputing — https://doi.org/10.1007/s11227-025-06928-1</w:t>
+        <w:t>Multilayer Semantic Perceptual Network for Aerial Tracking (2024) — Lecture notes in electrical engineering — https://doi.org/10.1007/978-981-97-8658-9_44</w:t>
       </w:r>
     </w:p>
     <w:p>
@@ -5938,7 +6850,7 @@
         <w:pStyle w:val="ListBullet"/>
       </w:pPr>
       <w:r>
-        <w:t>Memory optimization network for enhanced vision-language target tracking (2026) — The Journal of Supercomputing — https://doi.org/10.1007/s11227-026-08377-w</w:t>
+        <w:t>PMOSTRACK: A Video Object Tracking Framework with Positional Visualization and Mamba-Based Historical Modeling (2026) — Lecture notes in networks and systems — https://doi.org/10.1007/978-3-032-31236-5_8</w:t>
       </w:r>
     </w:p>
     <w:p>
@@ -5946,7 +6858,7 @@
         <w:pStyle w:val="ListBullet"/>
       </w:pPr>
       <w:r>
-        <w:t>Paf-tracker: a novel pre-frame auxiliary and fusion visual tracker (2024) — Machine Learning — https://doi.org/10.1007/s10994-023-06466-y</w:t>
+        <w:t>Re-detection UAV target tracking algorithm based on twin network (2026) — https://doi.org/10.1109/ciml69155.2026.11692792</w:t>
       </w:r>
     </w:p>
     <w:p>
@@ -5954,7 +6866,7 @@
         <w:pStyle w:val="ListBullet"/>
       </w:pPr>
       <w:r>
-        <w:t>Propagating prior information with transformer for robust visual object tracking (2024) — Multimedia Systems — https://doi.org/10.1007/s00530-024-01423-8</w:t>
+        <w:t>Research on Transformer Tracking with Temporal Context and Bounding Box Refinement Module (2025) — Communications in computer and information science — https://doi.org/10.1007/978-981-96-2186-6_17</w:t>
       </w:r>
     </w:p>
     <w:p>
@@ -5962,7 +6874,7 @@
         <w:pStyle w:val="ListBullet"/>
       </w:pPr>
       <w:r>
-        <w:t>SiamAUDT: adaptive updating decision for online Siamese tracker (2024) — Multimedia Tools and Applications — https://doi.org/10.1007/s11042-024-18587-0</w:t>
+        <w:t>Robust Transformer Tracking with Minimum Entropy Criterion Model Update (2023) — SSRN Electronic Journal — https://doi.org/10.2139/ssrn.4504064</w:t>
       </w:r>
     </w:p>
     <w:p>
@@ -5970,7 +6882,7 @@
         <w:pStyle w:val="ListBullet"/>
       </w:pPr>
       <w:r>
-        <w:t>TAPTrack: An Efficient Temporal-Aware Prompt Tracker for Infrared Anti-UAV Tracking (2026) — IEEE Transactions on Geoscience and Remote Sensing — https://doi.org/10.1109/tgrs.2026.3682081</w:t>
+        <w:t>SiamDTO: Mamba-Based Spatio-Temporal Attention for Satellite Video Object Tracking (2026) — Lecture notes in computer science — https://doi.org/10.1007/978-981-95-5755-4_11</w:t>
       </w:r>
     </w:p>
     <w:p>
@@ -5978,7 +6890,7 @@
         <w:pStyle w:val="ListBullet"/>
       </w:pPr>
       <w:r>
-        <w:t>Target-aware pooling combining global contexts for aerial tracking (2024) — The Visual Computer — https://doi.org/10.1007/s00371-024-03282-w</w:t>
+        <w:t>SiamMFT: Siamese MultiFrame Network in Infrared Small Target Tracking (2025) — Lecture notes in computer science — https://doi.org/10.1007/978-981-96-9856-1_1</w:t>
       </w:r>
     </w:p>
     <w:p>
@@ -5986,7 +6898,7 @@
         <w:pStyle w:val="ListBullet"/>
       </w:pPr>
       <w:r>
-        <w:t>Tracking Reflected Objects: A Benchmark (2024) — Lecture notes in computer science — https://doi.org/10.1007/978-981-96-0901-7_21</w:t>
+        <w:t>SiamXKD: Siamese Network for UAV Visual Tracking Based on Cross-Head Knowledge Distillation (2026) — Lecture notes in electrical engineering — https://doi.org/10.1007/978-981-95-4053-2_47</w:t>
       </w:r>
     </w:p>
     <w:p>
@@ -5994,7 +6906,7 @@
         <w:pStyle w:val="ListBullet"/>
       </w:pPr>
       <w:r>
-        <w:t>UAV Cross-Modal Image Registration: Large-Scale Dataset and Transformer-Based Approach (2024) — Lecture notes in computer science — https://doi.org/10.1007/978-981-97-1417-9_16</w:t>
+        <w:t>TMATrack: token merging for autoregressive visual object tracking (2025) — The Journal of Supercomputing — https://doi.org/10.1007/s11227-025-07498-y</w:t>
       </w:r>
     </w:p>
     <w:p>
@@ -6002,7 +6914,7 @@
         <w:pStyle w:val="ListBullet"/>
       </w:pPr>
       <w:r>
-        <w:t>A lightweight target detection method for pressure sensitive paint marker points (2026) — https://doi.org/10.1145/3829641.3829699</w:t>
+        <w:t>Target-Aware Gaussian Distribution Estimation for Satellite Video Object Tracking (2026) — IEEE Transactions on Geoscience and Remote Sensing — https://doi.org/10.1109/tgrs.2026.3704141</w:t>
       </w:r>
     </w:p>
     <w:p>
@@ -6010,7 +6922,7 @@
         <w:pStyle w:val="ListBullet"/>
       </w:pPr>
       <w:r>
-        <w:t>A novel lightweight Siamese-like tracker based on transformers with unidirectional mixed attention (2026) — Pattern Analysis and Applications — https://doi.org/10.1007/s10044-026-01771-3</w:t>
+        <w:t>Temporal Context Aggregation for Visual Tracking Using Valid Frame and Knowledge Token (2025) — Communications in computer and information science — https://doi.org/10.1007/978-981-95-3739-6_27</w:t>
       </w:r>
     </w:p>
     <w:p>
@@ -6018,7 +6930,7 @@
         <w:pStyle w:val="ListBullet"/>
       </w:pPr>
       <w:r>
-        <w:t>AMV-tracker: an adaptive multi-view complementary information tracking algorithm with a dynamic activation mechanism (2026) — Displays — https://doi.org/10.1016/j.displa.2026.103545</w:t>
+        <w:t>Towards Real-Time Drone Vision for Road Safety (2026) — Lecture notes in computer science — https://doi.org/10.1007/978-3-032-39518-4_31</w:t>
       </w:r>
     </w:p>
     <w:p>
@@ -6026,199 +6938,7 @@
         <w:pStyle w:val="ListBullet"/>
       </w:pPr>
       <w:r>
-        <w:t>Blur-guided motion and spatio-temporal swarm graph modeling for UAV intent understanding (2026) — Knowledge-Based Systems — https://doi.org/10.1016/j.knosys.2026.116895</w:t>
-      </w:r>
-    </w:p>
-    <w:p>
-      <w:pPr>
-        <w:pStyle w:val="ListBullet"/>
-      </w:pPr>
-      <w:r>
-        <w:t>Customizing the feature modulation for visual tracking (2023) — The Visual Computer — https://doi.org/10.1007/s00371-023-03182-5</w:t>
-      </w:r>
-    </w:p>
-    <w:p>
-      <w:pPr>
-        <w:pStyle w:val="ListBullet"/>
-      </w:pPr>
-      <w:r>
-        <w:t>DFCTrack: dynamic full-temporal context fusion for object tracking (2026) — International Journal of Machine Learning and Cybernetics — https://doi.org/10.1007/s13042-026-03261-8</w:t>
-      </w:r>
-    </w:p>
-    <w:p>
-      <w:pPr>
-        <w:pStyle w:val="ListBullet"/>
-      </w:pPr>
-      <w:r>
-        <w:t>DynaTrack-Air: Dynamic Template Fusion with Retrospective Consistency Verification for Robust UAV Tracking (2025) — China Automation Congress (CAC) — https://doi.org/10.1109/cac67268.2025.11487800</w:t>
-      </w:r>
-    </w:p>
-    <w:p>
-      <w:pPr>
-        <w:pStyle w:val="ListBullet"/>
-      </w:pPr>
-      <w:r>
-        <w:t>Efficient UAV Object Tracking via Visual Contrastive Attention and Hybrid Adaptive Computation (2026) — https://doi.org/10.1109/ust70584.2026.11663823</w:t>
-      </w:r>
-    </w:p>
-    <w:p>
-      <w:pPr>
-        <w:pStyle w:val="ListBullet"/>
-      </w:pPr>
-      <w:r>
-        <w:t>Feature Extraction with Refinement and Rebuilding Module for Visual Tracking (2025) — Signal Image and Video Processing — https://doi.org/10.1007/s11760-025-04487-9</w:t>
-      </w:r>
-    </w:p>
-    <w:p>
-      <w:pPr>
-        <w:pStyle w:val="ListBullet"/>
-      </w:pPr>
-      <w:r>
-        <w:t>Gradually target activating and self-supervised enhancing for visual tracking (2026) — Knowledge-Based Systems — https://doi.org/10.1016/j.knosys.2026.116779</w:t>
-      </w:r>
-    </w:p>
-    <w:p>
-      <w:pPr>
-        <w:pStyle w:val="ListBullet"/>
-      </w:pPr>
-      <w:r>
-        <w:t>HEATTrack: History Evidence Injection and Target-Aware Prompting for Aerial Multispectral Single-Object Tracking (2026) — IEEE Transactions on Geoscience and Remote Sensing — https://doi.org/10.1109/tgrs.2026.3709525</w:t>
-      </w:r>
-    </w:p>
-    <w:p>
-      <w:pPr>
-        <w:pStyle w:val="ListBullet"/>
-      </w:pPr>
-      <w:r>
-        <w:t>Learning Shallow-Robust Vision Transformers With Selective Distillation for Real-Time UAV Tracking (2026) — IEEE Transactions on Circuits and Systems for Video Technology — https://doi.org/10.1109/tcsvt.2026.3706810</w:t>
-      </w:r>
-    </w:p>
-    <w:p>
-      <w:pPr>
-        <w:pStyle w:val="ListBullet"/>
-      </w:pPr>
-      <w:r>
-        <w:t>Multilayer Semantic Perceptual Network for Aerial Tracking (2024) — Lecture notes in electrical engineering — https://doi.org/10.1007/978-981-97-8658-9_44</w:t>
-      </w:r>
-    </w:p>
-    <w:p>
-      <w:pPr>
-        <w:pStyle w:val="ListBullet"/>
-      </w:pPr>
-      <w:r>
-        <w:t>Object Tracking with Multiple Dynamic Templates Updating (2023) — Lecture notes in computer science — https://doi.org/10.1007/978-3-031-25825-1_11</w:t>
-      </w:r>
-    </w:p>
-    <w:p>
-      <w:pPr>
-        <w:pStyle w:val="ListBullet"/>
-      </w:pPr>
-      <w:r>
-        <w:t>PEBTrack: A Performance-Efficiency Balance Tracker for Aerial Scenario (2025) — Lecture notes in computer science — https://doi.org/10.1007/978-981-96-6596-9_14</w:t>
-      </w:r>
-    </w:p>
-    <w:p>
-      <w:pPr>
-        <w:pStyle w:val="ListBullet"/>
-      </w:pPr>
-      <w:r>
-        <w:t>PMOSTRACK: A Video Object Tracking Framework with Positional Visualization and Mamba-Based Historical Modeling (2026) — Lecture notes in networks and systems — https://doi.org/10.1007/978-3-032-31236-5_8</w:t>
-      </w:r>
-    </w:p>
-    <w:p>
-      <w:pPr>
-        <w:pStyle w:val="ListBullet"/>
-      </w:pPr>
-      <w:r>
-        <w:t>Re-detection UAV target tracking algorithm based on twin network (2026) — https://doi.org/10.1109/ciml69155.2026.11692792</w:t>
-      </w:r>
-    </w:p>
-    <w:p>
-      <w:pPr>
-        <w:pStyle w:val="ListBullet"/>
-      </w:pPr>
-      <w:r>
-        <w:t>Research on Transformer Tracking with Temporal Context and Bounding Box Refinement Module (2025) — Communications in computer and information science — https://doi.org/10.1007/978-981-96-2186-6_17</w:t>
-      </w:r>
-    </w:p>
-    <w:p>
-      <w:pPr>
-        <w:pStyle w:val="ListBullet"/>
-      </w:pPr>
-      <w:r>
-        <w:t>Robust Transformer Tracking with Minimum Entropy Criterion Model Update (2023) — SSRN Electronic Journal — https://doi.org/10.2139/ssrn.4504064</w:t>
-      </w:r>
-    </w:p>
-    <w:p>
-      <w:pPr>
-        <w:pStyle w:val="ListBullet"/>
-      </w:pPr>
-      <w:r>
-        <w:t>SiamDTO: Mamba-Based Spatio-Temporal Attention for Satellite Video Object Tracking (2026) — Lecture notes in computer science — https://doi.org/10.1007/978-981-95-5755-4_11</w:t>
-      </w:r>
-    </w:p>
-    <w:p>
-      <w:pPr>
-        <w:pStyle w:val="ListBullet"/>
-      </w:pPr>
-      <w:r>
-        <w:t>SiamMFT: Siamese MultiFrame Network in Infrared Small Target Tracking (2025) — Lecture notes in computer science — https://doi.org/10.1007/978-981-96-9856-1_1</w:t>
-      </w:r>
-    </w:p>
-    <w:p>
-      <w:pPr>
-        <w:pStyle w:val="ListBullet"/>
-      </w:pPr>
-      <w:r>
-        <w:t>SiamXKD: Siamese Network for UAV Visual Tracking Based on Cross-Head Knowledge Distillation (2026) — Lecture notes in electrical engineering — https://doi.org/10.1007/978-981-95-4053-2_47</w:t>
-      </w:r>
-    </w:p>
-    <w:p>
-      <w:pPr>
-        <w:pStyle w:val="ListBullet"/>
-      </w:pPr>
-      <w:r>
-        <w:t>TMATrack: token merging for autoregressive visual object tracking (2025) — The Journal of Supercomputing — https://doi.org/10.1007/s11227-025-07498-y</w:t>
-      </w:r>
-    </w:p>
-    <w:p>
-      <w:pPr>
-        <w:pStyle w:val="ListBullet"/>
-      </w:pPr>
-      <w:r>
-        <w:t>Target-Aware Gaussian Distribution Estimation for Satellite Video Object Tracking (2026) — IEEE Transactions on Geoscience and Remote Sensing — https://doi.org/10.1109/tgrs.2026.3704141</w:t>
-      </w:r>
-    </w:p>
-    <w:p>
-      <w:pPr>
-        <w:pStyle w:val="ListBullet"/>
-      </w:pPr>
-      <w:r>
-        <w:t>Temporal Context Aggregation for Visual Tracking Using Valid Frame and Knowledge Token (2025) — Communications in computer and information science — https://doi.org/10.1007/978-981-95-3739-6_27</w:t>
-      </w:r>
-    </w:p>
-    <w:p>
-      <w:pPr>
-        <w:pStyle w:val="ListBullet"/>
-      </w:pPr>
-      <w:r>
-        <w:t>Towards Real-Time Drone Vision for Road Safety (2026) — Lecture notes in computer science — https://doi.org/10.1007/978-3-032-39518-4_31</w:t>
-      </w:r>
-    </w:p>
-    <w:p>
-      <w:pPr>
-        <w:pStyle w:val="ListBullet"/>
-      </w:pPr>
-      <w:r>
         <w:t>Tracking Tiny Drones Against Clutter: Large-Scale Infrared Benchmark with Motion-Centric Adaptive Algorithm (2025) — IEEE/CVF International Conference on Computer Vision (ICCV) — https://doi.org/10.1109/iccv51701.2025.00691</w:t>
-      </w:r>
-    </w:p>
-    <w:p>
-      <w:pPr>
-        <w:pStyle w:val="ListBullet"/>
-      </w:pPr>
-      <w:r>
-        <w:t>UAV-Based Maritime Object Tracking: A New Data Set and Dynamic Multi-scale Fusion Transformer (2026) — SSRN Electronic Journal — https://doi.org/10.2139/ssrn.7345297</w:t>
       </w:r>
     </w:p>
     <w:sectPr>

</xml_diff>